<commit_message>
fix(SPEC-002): decisões das OPEN-201 e 204 a 209, e INV-004 no banco (etapa 24)
- RF-002 (OPEN-208): e-mail normalizado num lugar só. Um e-mail repetido
  com espaços estourava UNIQUE constraint failed em vez da mensagem.
- RN-00/RN-23 (OPEN-207): a P-08 da criação fica gravada em
  usuario.reputacao_inicial; o recálculo usava a P-08 atual e mudava a
  reputação de todas as contas. Bancos antigos ganham a coluna em migrar().
- SPEC-002 INV-004: gatilho BEFORE INSERT garante o estado inicial no banco.
- Spec v0.1.8 e SPEC-002 v1.3.0 com as demais decisões (senha, logout,
  campos do cadastro, admin por implantação, risco residual da OPEN-209).

Testes T-CONTA-01j, 01k e 01l falham contra o código anterior.

Co-Authored-By: Claude Opus 5.5 <noreply@anthropic.com>
</commit_message>
<xml_diff>
--- a/docs/proximos-passos.docx
+++ b/docs/proximos-passos.docx
@@ -241,17 +241,7 @@
           </w:tcPr>
           <w:p>
             <w:r>
-              <w:t xml:space="preserve">Aprovada, código conferido e corrigido, layout das 8 telas aprovado. </w:t>
-            </w:r>
-            <w:r>
-              <w:rPr>
-                <w:b/>
-                <w:bCs/>
-              </w:rPr>
-              <w:t xml:space="preserve">Falta:</w:t>
-            </w:r>
-            <w:r>
-              <w:t xml:space="preserve"> decidir OPEN-201, 204 a 209 e o INV-004 no banco (seção 5)</w:t>
+              <w:t xml:space="preserve">Aprovada (v1.3.0), código conferido e corrigido, layout das 8 telas aprovado e nenhuma questão aberta (seção 5)</w:t>
             </w:r>
           </w:p>
         </w:tc>
@@ -377,7 +367,7 @@
           </w:tcPr>
           <w:p>
             <w:r>
-              <w:t xml:space="preserve">v0.1.7, com as decisões da Trilha A (parâmetros, máquinas de estado, comissão)</w:t>
+              <w:t xml:space="preserve">v0.1.8: a v0.1.7 trouxe as decisões da Trilha A, e a v0.1.8 as da SPEC-002</w:t>
             </w:r>
           </w:p>
         </w:tc>
@@ -425,7 +415,7 @@
               <w:t xml:space="preserve">main</w:t>
             </w:r>
             <w:r>
-              <w:t xml:space="preserve">. 205 testes passando; o GitHub Actions roda </w:t>
+              <w:t xml:space="preserve">. 208 testes passando; o GitHub Actions roda </w:t>
             </w:r>
             <w:r>
               <w:rPr>
@@ -1453,19 +1443,6 @@
         <w:spacing w:after="60"/>
       </w:pPr>
       <w:r>
-        <w:t xml:space="preserve">Decidir as questões da SPEC-002 (seção 5).</w:t>
-      </w:r>
-    </w:p>
-    <w:p>
-      <w:pPr>
-        <w:pStyle w:val="ListParagraph"/>
-        <w:numPr>
-          <w:ilvl w:val="0"/>
-          <w:numId w:val="4"/>
-        </w:numPr>
-        <w:spacing w:after="60"/>
-      </w:pPr>
-      <w:r>
         <w:t xml:space="preserve">Responder às questões da §13 das SPEC-003 a 005 quando o 2dart5 chegar nelas.</w:t>
       </w:r>
     </w:p>
@@ -1610,7 +1587,7 @@
           </w:tcPr>
           <w:p>
             <w:r>
-              <w:t xml:space="preserve">Correções da SPEC-001 · conferência das SPEC-003 a 005 · decisões da SPEC-002</w:t>
+              <w:t xml:space="preserve">Correções da SPEC-001 · conferência das SPEC-003 a 005 · revisão dos PRs</w:t>
             </w:r>
           </w:p>
         </w:tc>
@@ -1886,7 +1863,7 @@
         <w:pStyle w:val="Heading1"/>
       </w:pPr>
       <w:r>
-        <w:t xml:space="preserve">5. Decisões pendentes da SPEC-002</w:t>
+        <w:t xml:space="preserve">5. Decisões da SPEC-002 (2026-10-20)</w:t>
       </w:r>
     </w:p>
     <w:p>
@@ -1894,18 +1871,7 @@
         <w:spacing w:after="120"/>
       </w:pPr>
       <w:r>
-        <w:t xml:space="preserve">São recomendações, ainda sem decisão. Quando a equipe decidir, a </w:t>
-      </w:r>
-      <w:r>
-        <w:rPr>
-          <w:rFonts w:ascii="Consolas" w:cs="Consolas" w:eastAsia="Consolas" w:hAnsi="Consolas"/>
-          <w:sz w:val="19"/>
-          <w:szCs w:val="19"/>
-        </w:rPr>
-        <w:t xml:space="preserve">docs/spec.md</w:t>
-      </w:r>
-      <w:r>
-        <w:t xml:space="preserve"> muda primeiro e a etapa vai para o registro.</w:t>
+        <w:t xml:space="preserve">Decididas pelo Enzo, já na spec v0.1.8 e na SPEC-002 v1.3.0 (registro, etapa 24). As correções de código citadas abaixo já estão feitas e testadas.</w:t>
       </w:r>
     </w:p>
     <w:tbl>
@@ -1966,7 +1932,7 @@
                 <w:b/>
                 <w:bCs/>
               </w:rPr>
-              <w:t xml:space="preserve">Recomendação</w:t>
+              <w:t xml:space="preserve">Decisão</w:t>
             </w:r>
           </w:p>
         </w:tc>
@@ -2003,7 +1969,7 @@
           </w:tcPr>
           <w:p>
             <w:r>
-              <w:t xml:space="preserve">Levar para a RF-001: mínimo de 8 caracteres, misturando letras e números. Não virar parâmetro, porque o admin não deve poder baixar um piso de segurança. O código já faz isso</w:t>
+              <w:t xml:space="preserve">Na RF-001: mínimo de 8 caracteres, misturando letras e números. Não é parâmetro, para o admin não poder baixar um piso de segurança</w:t>
             </w:r>
           </w:p>
         </w:tc>
@@ -2040,7 +2006,7 @@
           </w:tcPr>
           <w:p>
             <w:r>
-              <w:t xml:space="preserve">Criar um RF: encerrar a sessão revoga a sessão no servidor. Já existe no código e no teste T-SESSAO-05</w:t>
+              <w:t xml:space="preserve">Vira a RF-005a: sair encerra a sessão no servidor (teste T-SESSAO-05)</w:t>
             </w:r>
           </w:p>
         </w:tc>
@@ -2077,7 +2043,7 @@
           </w:tcPr>
           <w:p>
             <w:r>
-              <w:t xml:space="preserve">A RF-001 exige nome, e-mail, senha e perfil. Telefone e região são opcionais; o nome de exibição do prestador é opcional e usa o nome quando vazio. É o que o código faz</w:t>
+              <w:t xml:space="preserve">Nome, e-mail, senha e perfil obrigatórios. Telefone, região e nome de exibição do prestador opcionais (RF-001)</w:t>
             </w:r>
           </w:p>
         </w:tc>
@@ -2114,7 +2080,7 @@
           </w:tcPr>
           <w:p>
             <w:r>
-              <w:t xml:space="preserve">Sem RF de tela: o admin nasce por procedimento de implantação (o seed), registrado no ADR-004 e no README. O cadastro público nunca oferece ADMIN (CA-05)</w:t>
+              <w:t xml:space="preserve">O admin nasce só pelo procedimento de implantação (o seed), registrado no ADR-004 e no README. O cadastro nunca oferece ADMIN</w:t>
             </w:r>
           </w:p>
         </w:tc>
@@ -2151,64 +2117,17 @@
           </w:tcPr>
           <w:p>
             <w:r>
-              <w:t xml:space="preserve">Fórmula "P-08 + soma dos eventos", com a P-08 </w:t>
+              <w:t xml:space="preserve">Reputação = P-08 </w:t>
             </w:r>
             <w:r>
               <w:rPr>
                 <w:b/>
                 <w:bCs/>
               </w:rPr>
-              <w:t xml:space="preserve">travada na criação da conta</w:t>
-            </w:r>
-            <w:r>
-              <w:t xml:space="preserve">. Hoje o código usa a P-08 atual: se o admin mudar a P-08, a reputação de todas as contas muda, o que fere a RN-00. Um evento de abertura não serve, porque sairia da janela P-20 depois de 90 dias</w:t>
-            </w:r>
-          </w:p>
-        </w:tc>
-      </w:tr>
-      <w:tr>
-        <w:trPr>
-          <w:tblHeader w:val="false"/>
-        </w:trPr>
-        <w:tc>
-          <w:tcPr>
-            <w:tcW w:type="dxa" w:w="2500"/>
-            <w:tcMar>
-              <w:top w:type="dxa" w:w="60"/>
-              <w:left w:type="dxa" w:w="100"/>
-              <w:bottom w:type="dxa" w:w="60"/>
-              <w:right w:type="dxa" w:w="100"/>
-            </w:tcMar>
-          </w:tcPr>
-          <w:p>
-            <w:r>
-              <w:t xml:space="preserve">OPEN-208: normalizar e-mail</w:t>
-            </w:r>
-          </w:p>
-        </w:tc>
-        <w:tc>
-          <w:tcPr>
-            <w:tcW w:type="dxa" w:w="6526"/>
-            <w:tcMar>
-              <w:top w:type="dxa" w:w="60"/>
-              <w:left w:type="dxa" w:w="100"/>
-              <w:bottom w:type="dxa" w:w="60"/>
-              <w:right w:type="dxa" w:w="100"/>
-            </w:tcMar>
-          </w:tcPr>
-          <w:p>
-            <w:r>
-              <w:t xml:space="preserve">Tirar espaços e passar para minúsculas num lugar só, antes de verificar, gravar e autenticar. </w:t>
-            </w:r>
-            <w:r>
-              <w:rPr>
-                <w:b/>
-                <w:bCs/>
-              </w:rPr>
-              <w:t xml:space="preserve">Bug confirmado:</w:t>
-            </w:r>
-            <w:r>
-              <w:t xml:space="preserve"> cadastrar " Ana@x.dev " quando ana@x.dev existe estoura </w:t>
+              <w:t xml:space="preserve">da criação da conta</w:t>
+            </w:r>
+            <w:r>
+              <w:t xml:space="preserve"> + eventos. Gravada em </w:t>
             </w:r>
             <w:r>
               <w:rPr>
@@ -2216,10 +2135,10 @@
                 <w:sz w:val="19"/>
                 <w:szCs w:val="19"/>
               </w:rPr>
-              <w:t xml:space="preserve">UNIQUE constraint failed</w:t>
-            </w:r>
-            <w:r>
-              <w:t xml:space="preserve"> em vez da mensagem "não está disponível"</w:t>
+              <w:t xml:space="preserve">usuario.reputacao_inicial</w:t>
+            </w:r>
+            <w:r>
+              <w:t xml:space="preserve">. O código usava a P-08 atual e foi corrigido (T-CONTA-01l)</w:t>
             </w:r>
           </w:p>
         </w:tc>
@@ -2240,7 +2159,7 @@
           </w:tcPr>
           <w:p>
             <w:r>
-              <w:t xml:space="preserve">OPEN-209: enumeração de e-mail</w:t>
+              <w:t xml:space="preserve">OPEN-208: normalizar e-mail</w:t>
             </w:r>
           </w:p>
         </w:tc>
@@ -2256,7 +2175,7 @@
           </w:tcPr>
           <w:p>
             <w:r>
-              <w:t xml:space="preserve">Aceitar como risco residual e registrar em </w:t>
+              <w:t xml:space="preserve">Sem espaços nas pontas e sem diferenciar maiúsculas, normalizado só no repositório. Corrigido o bug em que um e-mail repetido com espaços estourava </w:t>
             </w:r>
             <w:r>
               <w:rPr>
@@ -2264,10 +2183,10 @@
                 <w:sz w:val="19"/>
                 <w:szCs w:val="19"/>
               </w:rPr>
-              <w:t xml:space="preserve">seguranca.md</w:t>
-            </w:r>
-            <w:r>
-              <w:t xml:space="preserve">. Esconder exigiria confirmação por e-mail, que o MVP não tem</w:t>
+              <w:t xml:space="preserve">UNIQUE constraint failed</w:t>
+            </w:r>
+            <w:r>
+              <w:t xml:space="preserve"> (T-CONTA-01j)</w:t>
             </w:r>
           </w:p>
         </w:tc>
@@ -2288,7 +2207,7 @@
           </w:tcPr>
           <w:p>
             <w:r>
-              <w:t xml:space="preserve">INV-004 no banco</w:t>
+              <w:t xml:space="preserve">OPEN-209: enumeração de e-mail</w:t>
             </w:r>
           </w:p>
         </w:tc>
@@ -2304,7 +2223,7 @@
           </w:tcPr>
           <w:p>
             <w:r>
-              <w:t xml:space="preserve">Gatilho </w:t>
+              <w:t xml:space="preserve">Risco residual aceito, registrado em </w:t>
             </w:r>
             <w:r>
               <w:rPr>
@@ -2312,10 +2231,47 @@
                 <w:sz w:val="19"/>
                 <w:szCs w:val="19"/>
               </w:rPr>
-              <w:t xml:space="preserve">BEFORE INSERT</w:t>
-            </w:r>
-            <w:r>
-              <w:t xml:space="preserve"> que recusa cliente que não nasce </w:t>
+              <w:t xml:space="preserve">seguranca.md</w:t>
+            </w:r>
+            <w:r>
+              <w:t xml:space="preserve"> A2. Esconder exigiria confirmação por e-mail, que o MVP não tem</w:t>
+            </w:r>
+          </w:p>
+        </w:tc>
+      </w:tr>
+      <w:tr>
+        <w:trPr>
+          <w:tblHeader w:val="false"/>
+        </w:trPr>
+        <w:tc>
+          <w:tcPr>
+            <w:tcW w:type="dxa" w:w="2500"/>
+            <w:tcMar>
+              <w:top w:type="dxa" w:w="60"/>
+              <w:left w:type="dxa" w:w="100"/>
+              <w:bottom w:type="dxa" w:w="60"/>
+              <w:right w:type="dxa" w:w="100"/>
+            </w:tcMar>
+          </w:tcPr>
+          <w:p>
+            <w:r>
+              <w:t xml:space="preserve">INV-004 no banco</w:t>
+            </w:r>
+          </w:p>
+        </w:tc>
+        <w:tc>
+          <w:tcPr>
+            <w:tcW w:type="dxa" w:w="6526"/>
+            <w:tcMar>
+              <w:top w:type="dxa" w:w="60"/>
+              <w:left w:type="dxa" w:w="100"/>
+              <w:bottom w:type="dxa" w:w="60"/>
+              <w:right w:type="dxa" w:w="100"/>
+            </w:tcMar>
+          </w:tcPr>
+          <w:p>
+            <w:r>
+              <w:t xml:space="preserve">Gatilho </w:t>
             </w:r>
             <w:r>
               <w:rPr>
@@ -2323,10 +2279,10 @@
                 <w:sz w:val="19"/>
                 <w:szCs w:val="19"/>
               </w:rPr>
-              <w:t xml:space="preserve">ATIVO</w:t>
-            </w:r>
-            <w:r>
-              <w:t xml:space="preserve"> e prestador que não nasce </w:t>
+              <w:t xml:space="preserve">BEFORE INSERT</w:t>
+            </w:r>
+            <w:r>
+              <w:t xml:space="preserve"> </w:t>
             </w:r>
             <w:r>
               <w:rPr>
@@ -2334,10 +2290,10 @@
                 <w:sz w:val="19"/>
                 <w:szCs w:val="19"/>
               </w:rPr>
-              <w:t xml:space="preserve">PENDENTE_APROVACAO</w:t>
-            </w:r>
-            <w:r>
-              <w:t xml:space="preserve">. Ele só olha a criação, então as mudanças de estado seguintes continuam livres</w:t>
+              <w:t xml:space="preserve">usuario_nasce_no_estado_inicial</w:t>
+            </w:r>
+            <w:r>
+              <w:t xml:space="preserve">. Só olha a criação, então as mudanças de estado seguintes continuam livres (T-CONTA-01k)</w:t>
             </w:r>
           </w:p>
         </w:tc>
@@ -2656,7 +2612,7 @@
           </w:tcPr>
           <w:p>
             <w:r>
-              <w:t xml:space="preserve">fonte de verdade (v0.1.7): regras, requisitos, estados e invariantes</w:t>
+              <w:t xml:space="preserve">fonte de verdade (v0.1.8): regras, requisitos, estados e invariantes</w:t>
             </w:r>
           </w:p>
         </w:tc>
@@ -2782,7 +2738,7 @@
           </w:tcPr>
           <w:p>
             <w:r>
-              <w:t xml:space="preserve">diário de cada etapa: o que foi pedido, decidido e feito (etapas 1 a 23)</w:t>
+              <w:t xml:space="preserve">diário de cada etapa: o que foi pedido, decidido e feito (etapas 1 a 24)</w:t>
             </w:r>
           </w:p>
         </w:tc>
@@ -3014,7 +2970,7 @@
           <w:numId w:val="4"/>
         </w:numPr>
       </w:pPr>
-      <w:hyperlink w:history="1" r:id="rIdsq1lmupf6aib1eoxvsac3">
+      <w:hyperlink w:history="1" r:id="rIdtttgrbmbrhdzxko9ka1m_">
         <w:r>
           <w:rPr>
             <w:rStyle w:val="Hyperlink"/>
@@ -3031,7 +2987,7 @@
           <w:numId w:val="4"/>
         </w:numPr>
       </w:pPr>
-      <w:hyperlink w:history="1" r:id="rIdgpt0u-f0uk-tjswfacvnl">
+      <w:hyperlink w:history="1" r:id="rIdragt29ylkqfnclyld9co4">
         <w:r>
           <w:rPr>
             <w:rStyle w:val="Hyperlink"/>

</xml_diff>

<commit_message>
docs: documento de passagem e CLAUDE.md com o estado de 2026-10-22
- proximos-passos.docx reescrito: SPEC-001 e 002 concluídas, rascunhos da
  Trilha A não aprovados, o que cada um faz agora e o que mudou nas etapas 25 a 28.
- CLAUDE.md: critério para fechar issue (Closes #N e DoD inteira), ator real na
  auditoria, armadilha de margem dentro de .grade e como conferir o .docx nesta
  máquina.
- Registro: fecho da etapa 28 (as SPEC-003 a 005 continuam com o 2dart5).

Co-Authored-By: Claude Opus 5.5 <noreply@anthropic.com>
</commit_message>
<xml_diff>
--- a/docs/proximos-passos.docx
+++ b/docs/proximos-passos.docx
@@ -23,10 +23,8 @@
       </w:pPr>
       <w:r>
         <w:rPr>
-          <w:b/>
-          <w:bCs/>
-          <w:sz w:val="32"/>
-          <w:szCs w:val="32"/>
+          <w:sz w:val="56"/>
+          <w:szCs w:val="56"/>
         </w:rPr>
         <w:t xml:space="preserve">Próximos passos do projeto</w:t>
       </w:r>
@@ -36,7 +34,7 @@
         <w:spacing w:after="120"/>
       </w:pPr>
       <w:r>
-        <w:t xml:space="preserve">Modelagem de Software · 2026-2 · Turma 04I · documento de passagem de 2026-10-20 (substitui o de 2026-10-01)</w:t>
+        <w:t xml:space="preserve">Modelagem de Software · 2026-2 · Turma 04I · documento de passagem de 2026-10-22 (substitui o de 2026-10-20)</w:t>
       </w:r>
     </w:p>
     <w:p>
@@ -51,12 +49,13 @@
         <w:t xml:space="preserve">Para quem é:</w:t>
       </w:r>
       <w:r>
-        <w:t xml:space="preserve"> os três integrantes. Mostra onde o projeto está hoje, o que cada um faz a seguir e quais decisões ainda faltam. Quem leu a versão de 2026-10-01 pode ir direto às seções 3 e 4.</w:t>
+        <w:t xml:space="preserve"> os três integrantes. Mostra onde o projeto está hoje, o que cada um faz a seguir e quais decisões ainda faltam. Quem leu a versão de 2026-10-20 pode ir direto às seções 4 e 5.</w:t>
       </w:r>
     </w:p>
     <w:p>
       <w:pPr>
         <w:pStyle w:val="Heading1"/>
+        <w:spacing w:before="280" w:after="120"/>
       </w:pPr>
       <w:r>
         <w:t xml:space="preserve">1. Onde o projeto está</w:t>
@@ -194,17 +193,14 @@
           </w:tcPr>
           <w:p>
             <w:r>
-              <w:t xml:space="preserve">Aprovada, v1.1.0, sem questões abertas. </w:t>
-            </w:r>
-            <w:r>
               <w:rPr>
                 <w:b/>
                 <w:bCs/>
               </w:rPr>
-              <w:t xml:space="preserve">Falta:</w:t>
-            </w:r>
-            <w:r>
-              <w:t xml:space="preserve"> o código receber as oito correções da seção 4</w:t>
+              <w:t xml:space="preserve">Concluída</w:t>
+            </w:r>
+            <w:r>
+              <w:t xml:space="preserve"> (v1.2.0): as oito correções entraram, o código foi conferido e todos os CA, INV e RNF têm teste. Issues #80 e #9 fechadas</w:t>
             </w:r>
           </w:p>
         </w:tc>
@@ -240,118 +236,47 @@
             </w:tcMar>
           </w:tcPr>
           <w:p>
-            <w:r>
-              <w:t xml:space="preserve">Aprovada (v1.3.0), código conferido e corrigido, layout das 8 telas aprovado e nenhuma questão aberta (seção 5)</w:t>
-            </w:r>
-          </w:p>
-        </w:tc>
-      </w:tr>
-      <w:tr>
-        <w:trPr>
-          <w:tblHeader w:val="false"/>
-        </w:trPr>
-        <w:tc>
-          <w:tcPr>
-            <w:tcW w:type="dxa" w:w="2700"/>
-            <w:tcMar>
-              <w:top w:type="dxa" w:w="60"/>
-              <w:left w:type="dxa" w:w="100"/>
-              <w:bottom w:type="dxa" w:w="60"/>
-              <w:right w:type="dxa" w:w="100"/>
-            </w:tcMar>
-          </w:tcPr>
-          <w:p>
-            <w:r>
-              <w:t xml:space="preserve">SPEC-003, 004 e 005</w:t>
-            </w:r>
-          </w:p>
-        </w:tc>
-        <w:tc>
-          <w:tcPr>
-            <w:tcW w:type="dxa" w:w="6326"/>
-            <w:tcMar>
-              <w:top w:type="dxa" w:w="60"/>
-              <w:left w:type="dxa" w:w="100"/>
-              <w:bottom w:type="dxa" w:w="60"/>
-              <w:right w:type="dxa" w:w="100"/>
-            </w:tcMar>
-          </w:tcPr>
-          <w:p>
-            <w:r>
-              <w:t xml:space="preserve">Aprovadas em 2026-10-20. </w:t>
-            </w:r>
             <w:r>
               <w:rPr>
                 <w:b/>
                 <w:bCs/>
               </w:rPr>
-              <w:t xml:space="preserve">Falta:</w:t>
-            </w:r>
-            <w:r>
-              <w:t xml:space="preserve"> conferir o código contra elas</w:t>
-            </w:r>
-          </w:p>
-        </w:tc>
-      </w:tr>
-      <w:tr>
-        <w:trPr>
-          <w:tblHeader w:val="false"/>
-        </w:trPr>
-        <w:tc>
-          <w:tcPr>
-            <w:tcW w:type="dxa" w:w="2700"/>
-            <w:tcMar>
-              <w:top w:type="dxa" w:w="60"/>
-              <w:left w:type="dxa" w:w="100"/>
-              <w:bottom w:type="dxa" w:w="60"/>
-              <w:right w:type="dxa" w:w="100"/>
-            </w:tcMar>
-          </w:tcPr>
-          <w:p>
-            <w:r>
-              <w:t xml:space="preserve">SPEC-006 a SPEC-029</w:t>
-            </w:r>
-          </w:p>
-        </w:tc>
-        <w:tc>
-          <w:tcPr>
-            <w:tcW w:type="dxa" w:w="6326"/>
-            <w:tcMar>
-              <w:top w:type="dxa" w:w="60"/>
-              <w:left w:type="dxa" w:w="100"/>
-              <w:bottom w:type="dxa" w:w="60"/>
-              <w:right w:type="dxa" w:w="100"/>
-            </w:tcMar>
-          </w:tcPr>
-          <w:p>
-            <w:r>
-              <w:t xml:space="preserve">A gerar, uma por vez, na ordem do mapa. A próxima é a SPEC-006</w:t>
-            </w:r>
-          </w:p>
-        </w:tc>
-      </w:tr>
-      <w:tr>
-        <w:trPr>
-          <w:tblHeader w:val="false"/>
-        </w:trPr>
-        <w:tc>
-          <w:tcPr>
-            <w:tcW w:type="dxa" w:w="2700"/>
-            <w:tcMar>
-              <w:top w:type="dxa" w:w="60"/>
-              <w:left w:type="dxa" w:w="100"/>
-              <w:bottom w:type="dxa" w:w="60"/>
-              <w:right w:type="dxa" w:w="100"/>
-            </w:tcMar>
-          </w:tcPr>
-          <w:p>
+              <w:t xml:space="preserve">Concluída</w:t>
+            </w:r>
+            <w:r>
+              <w:t xml:space="preserve"> (v1.4.0): código conferido, layout aprovado e o canal de contato da conta suspensa definido (e-mail </w:t>
+            </w:r>
             <w:r>
               <w:rPr>
                 <w:rFonts w:ascii="Consolas" w:cs="Consolas" w:eastAsia="Consolas" w:hAnsi="Consolas"/>
                 <w:sz w:val="19"/>
                 <w:szCs w:val="19"/>
               </w:rPr>
-              <w:t xml:space="preserve">docs/spec.md</w:t>
+              <w:t xml:space="preserve">CONTATO_SUPORTE</w:t>
+            </w:r>
+            <w:r>
+              <w:t xml:space="preserve">)</w:t>
+            </w:r>
+          </w:p>
+        </w:tc>
+      </w:tr>
+      <w:tr>
+        <w:trPr>
+          <w:tblHeader w:val="false"/>
+        </w:trPr>
+        <w:tc>
+          <w:tcPr>
+            <w:tcW w:type="dxa" w:w="2700"/>
+            <w:tcMar>
+              <w:top w:type="dxa" w:w="60"/>
+              <w:left w:type="dxa" w:w="100"/>
+              <w:bottom w:type="dxa" w:w="60"/>
+              <w:right w:type="dxa" w:w="100"/>
+            </w:tcMar>
+          </w:tcPr>
+          <w:p>
+            <w:r>
+              <w:t xml:space="preserve">SPEC-003, 004 e 005</w:t>
             </w:r>
           </w:p>
         </w:tc>
@@ -367,7 +292,7 @@
           </w:tcPr>
           <w:p>
             <w:r>
-              <w:t xml:space="preserve">v0.1.8: a v0.1.7 trouxe as decisões da Trilha A, e a v0.1.8 as da SPEC-002</w:t>
+              <w:t xml:space="preserve">Aprovadas em 2026-10-20. Falta: conferir o código contra elas (2dart5)</w:t>
             </w:r>
           </w:p>
         </w:tc>
@@ -388,7 +313,7 @@
           </w:tcPr>
           <w:p>
             <w:r>
-              <w:t xml:space="preserve">Código e testes</w:t>
+              <w:t xml:space="preserve">SPEC-006 a 009, 011, 020, 021, 024 e 026</w:t>
             </w:r>
           </w:p>
         </w:tc>
@@ -404,7 +329,14 @@
           </w:tcPr>
           <w:p>
             <w:r>
-              <w:t xml:space="preserve">Tudo na </w:t>
+              <w:rPr>
+                <w:b/>
+                <w:bCs/>
+              </w:rPr>
+              <w:t xml:space="preserve">Rascunhos, não aprovados.</w:t>
+            </w:r>
+            <w:r>
+              <w:t xml:space="preserve"> Estão na </w:t>
             </w:r>
             <w:r>
               <w:rPr>
@@ -415,7 +347,129 @@
               <w:t xml:space="preserve">main</w:t>
             </w:r>
             <w:r>
-              <w:t xml:space="preserve">. 208 testes passando; o GitHub Actions roda </w:t>
+              <w:t xml:space="preserve"> (PRs #122, #126 e #127), mas o merge não aprova. Aprovação uma por vez, começando pela SPEC-006</w:t>
+            </w:r>
+          </w:p>
+        </w:tc>
+      </w:tr>
+      <w:tr>
+        <w:trPr>
+          <w:tblHeader w:val="false"/>
+        </w:trPr>
+        <w:tc>
+          <w:tcPr>
+            <w:tcW w:type="dxa" w:w="2700"/>
+            <w:tcMar>
+              <w:top w:type="dxa" w:w="60"/>
+              <w:left w:type="dxa" w:w="100"/>
+              <w:bottom w:type="dxa" w:w="60"/>
+              <w:right w:type="dxa" w:w="100"/>
+            </w:tcMar>
+          </w:tcPr>
+          <w:p>
+            <w:r>
+              <w:t xml:space="preserve">SPEC-010, 012 a 019, 022, 023, 025, 027 a 029</w:t>
+            </w:r>
+          </w:p>
+        </w:tc>
+        <w:tc>
+          <w:tcPr>
+            <w:tcW w:type="dxa" w:w="6326"/>
+            <w:tcMar>
+              <w:top w:type="dxa" w:w="60"/>
+              <w:left w:type="dxa" w:w="100"/>
+              <w:bottom w:type="dxa" w:w="60"/>
+              <w:right w:type="dxa" w:w="100"/>
+            </w:tcMar>
+          </w:tcPr>
+          <w:p>
+            <w:r>
+              <w:t xml:space="preserve">Ainda não escritas</w:t>
+            </w:r>
+          </w:p>
+        </w:tc>
+      </w:tr>
+      <w:tr>
+        <w:trPr>
+          <w:tblHeader w:val="false"/>
+        </w:trPr>
+        <w:tc>
+          <w:tcPr>
+            <w:tcW w:type="dxa" w:w="2700"/>
+            <w:tcMar>
+              <w:top w:type="dxa" w:w="60"/>
+              <w:left w:type="dxa" w:w="100"/>
+              <w:bottom w:type="dxa" w:w="60"/>
+              <w:right w:type="dxa" w:w="100"/>
+            </w:tcMar>
+          </w:tcPr>
+          <w:p>
+            <w:r>
+              <w:t xml:space="preserve">docs/spec.md</w:t>
+            </w:r>
+          </w:p>
+        </w:tc>
+        <w:tc>
+          <w:tcPr>
+            <w:tcW w:type="dxa" w:w="6326"/>
+            <w:tcMar>
+              <w:top w:type="dxa" w:w="60"/>
+              <w:left w:type="dxa" w:w="100"/>
+              <w:bottom w:type="dxa" w:w="60"/>
+              <w:right w:type="dxa" w:w="100"/>
+            </w:tcMar>
+          </w:tcPr>
+          <w:p>
+            <w:r>
+              <w:t xml:space="preserve">v0.1.9: a v0.1.8 trouxe as decisões da SPEC-002, e a v0.1.9 o canal de contato da conta suspensa (RF-004)</w:t>
+            </w:r>
+          </w:p>
+        </w:tc>
+      </w:tr>
+      <w:tr>
+        <w:trPr>
+          <w:tblHeader w:val="false"/>
+        </w:trPr>
+        <w:tc>
+          <w:tcPr>
+            <w:tcW w:type="dxa" w:w="2700"/>
+            <w:tcMar>
+              <w:top w:type="dxa" w:w="60"/>
+              <w:left w:type="dxa" w:w="100"/>
+              <w:bottom w:type="dxa" w:w="60"/>
+              <w:right w:type="dxa" w:w="100"/>
+            </w:tcMar>
+          </w:tcPr>
+          <w:p>
+            <w:r>
+              <w:t xml:space="preserve">Código e testes</w:t>
+            </w:r>
+          </w:p>
+        </w:tc>
+        <w:tc>
+          <w:tcPr>
+            <w:tcW w:type="dxa" w:w="6326"/>
+            <w:tcMar>
+              <w:top w:type="dxa" w:w="60"/>
+              <w:left w:type="dxa" w:w="100"/>
+              <w:bottom w:type="dxa" w:w="60"/>
+              <w:right w:type="dxa" w:w="100"/>
+            </w:tcMar>
+          </w:tcPr>
+          <w:p>
+            <w:r>
+              <w:t xml:space="preserve">Tudo na </w:t>
+            </w:r>
+            <w:r>
+              <w:rPr>
+                <w:rFonts w:ascii="Consolas" w:cs="Consolas" w:eastAsia="Consolas" w:hAnsi="Consolas"/>
+                <w:sz w:val="19"/>
+                <w:szCs w:val="19"/>
+              </w:rPr>
+              <w:t xml:space="preserve">main</w:t>
+            </w:r>
+            <w:r>
+              <w:t xml:space="preserve">. 235 testes passando; o GitHub Actions roda </w:t>
             </w:r>
             <w:r>
               <w:rPr>
@@ -463,7 +517,7 @@
           </w:tcPr>
           <w:p>
             <w:r>
-              <w:t xml:space="preserve">59 fechadas e 48 abertas. Nenhuma foi esquecida aberta: tarefa só fecha depois da conferência da Spec dela</w:t>
+              <w:t xml:space="preserve">61 fechadas e 46 abertas (gostislavs 16, 2dart5 30). Tarefa só fecha depois da conferência da Spec dela</w:t>
             </w:r>
           </w:p>
         </w:tc>
@@ -471,27 +525,21 @@
     </w:tbl>
     <w:p>
       <w:pPr>
-        <w:pBdr>
-          <w:left w:val="single" w:color="3B41C5" w:sz="18" w:space="8"/>
-        </w:pBdr>
-        <w:shd w:fill="EAEBFB" w:color="auto" w:val="clear"/>
-        <w:spacing w:before="120" w:after="160"/>
-        <w:ind w:left="120" w:right="120"/>
-      </w:pPr>
-      <w:r>
-        <w:rPr>
-          <w:b/>
-          <w:bCs/>
-        </w:rPr>
-        <w:t xml:space="preserve">O código veio antes das Specs.</w:t>
-      </w:r>
-      <w:r>
-        <w:t xml:space="preserve"> O trabalho, na maior parte, é conferir o código existente contra cada Spec aprovada e corrigir onde ele diverge (OPEN-01, decidida em 2026-10-08). Não é reescrever o sistema.</w:t>
+        <w:spacing w:after="60"/>
+      </w:pPr>
+    </w:p>
+    <w:p>
+      <w:pPr>
+        <w:spacing w:after="120"/>
+      </w:pPr>
+      <w:r>
+        <w:t xml:space="preserve">O código veio antes das Specs. O trabalho, na maior parte, é conferir o código existente contra cada Spec aprovada e corrigir onde ele diverge (OPEN-01, decidida em 2026-10-08). Não é reescrever o sistema.</w:t>
       </w:r>
     </w:p>
     <w:p>
       <w:pPr>
         <w:pStyle w:val="Heading1"/>
+        <w:spacing w:before="280" w:after="120"/>
       </w:pPr>
       <w:r>
         <w:t xml:space="preserve">2. Como trabalhar: o ciclo de cada Spec</w:t>
@@ -515,7 +563,7 @@
         <w:spacing w:after="60"/>
       </w:pPr>
       <w:r>
-        <w:t xml:space="preserve">Gerar a Spec com o prompt do roteiro ("Gerar SPEC-0XX"), uma por vez, na ordem do mapa, com as 14 seções.</w:t>
+        <w:t xml:space="preserve">Gerar a Spec com o prompt do roteiro ("Gerar SPEC-0XX"), uma por vez, na ordem do mapa, com as 14 seções. Spec com tela também precisa de layout.</w:t>
       </w:r>
     </w:p>
     <w:p>
@@ -602,12 +650,24 @@
         <w:spacing w:after="60"/>
       </w:pPr>
       <w:r>
-        <w:t xml:space="preserve">Fechar as issues relacionadas e registrar a etapa no registro.</w:t>
+        <w:t xml:space="preserve">Abrir o PR com </w:t>
+      </w:r>
+      <w:r>
+        <w:rPr>
+          <w:rFonts w:ascii="Consolas" w:cs="Consolas" w:eastAsia="Consolas" w:hAnsi="Consolas"/>
+          <w:sz w:val="19"/>
+          <w:szCs w:val="19"/>
+        </w:rPr>
+        <w:t xml:space="preserve">Closes #N</w:t>
+      </w:r>
+      <w:r>
+        <w:t xml:space="preserve"> para as issues que ele conclui, e registrar a etapa no registro.</w:t>
       </w:r>
     </w:p>
     <w:p>
       <w:pPr>
         <w:pStyle w:val="Heading2"/>
+        <w:spacing w:before="200" w:after="100"/>
       </w:pPr>
       <w:r>
         <w:t xml:space="preserve">A regra fundamental</w:t>
@@ -635,6 +695,35 @@
     <w:p>
       <w:pPr>
         <w:pStyle w:val="Heading2"/>
+        <w:spacing w:before="200" w:after="100"/>
+      </w:pPr>
+      <w:r>
+        <w:t xml:space="preserve">Para uma issue fechar</w:t>
+      </w:r>
+    </w:p>
+    <w:p>
+      <w:pPr>
+        <w:spacing w:after="120"/>
+      </w:pPr>
+      <w:r>
+        <w:t xml:space="preserve">O GitHub só fecha a issue no merge se o PR disser </w:t>
+      </w:r>
+      <w:r>
+        <w:rPr>
+          <w:rFonts w:ascii="Consolas" w:cs="Consolas" w:eastAsia="Consolas" w:hAnsi="Consolas"/>
+          <w:sz w:val="19"/>
+          <w:szCs w:val="19"/>
+        </w:rPr>
+        <w:t xml:space="preserve">Closes #N</w:t>
+      </w:r>
+      <w:r>
+        <w:t xml:space="preserve">. E o critério é a Definition of Done inteira da Spec, não só a aprovação do texto: cada CA, INV e RNF precisa ter teste. A SPEC-001 (etapa 28) é o exemplo: a seção 12 ganhou uma tabela de evidência dizendo qual teste cobre cada critério.</w:t>
+      </w:r>
+    </w:p>
+    <w:p>
+      <w:pPr>
+        <w:pStyle w:val="Heading2"/>
+        <w:spacing w:before="200" w:after="100"/>
       </w:pPr>
       <w:r>
         <w:t xml:space="preserve">Cuidado com pull requests empilhados</w:t>
@@ -645,7 +734,7 @@
         <w:spacing w:after="120"/>
       </w:pPr>
       <w:r>
-        <w:t xml:space="preserve">Os PRs #111, #112 e #113 foram aprovados e mergeados, mas cada um apontava para a branch do anterior. Como o #110 entrou na </w:t>
+        <w:t xml:space="preserve">Abra cada PR direto contra a </w:t>
       </w:r>
       <w:r>
         <w:rPr>
@@ -656,22 +745,13 @@
         <w:t xml:space="preserve">main</w:t>
       </w:r>
       <w:r>
-        <w:t xml:space="preserve"> antes, o conteúdo dos outros três ficou preso nas branches intermediárias, e foi recuperado só no #114. </w:t>
-      </w:r>
-      <w:r>
-        <w:rPr>
-          <w:b/>
-          <w:bCs/>
-        </w:rPr>
-        <w:t xml:space="preserve">Abra cada PR direto contra a main</w:t>
-      </w:r>
-      <w:r>
-        <w:t xml:space="preserve">. Se um depender de outro, espere o primeiro entrar e atualize a base antes de mergear o segundo.</w:t>
+        <w:t xml:space="preserve">. Se um depender de outro, espere o primeiro entrar e atualize a base antes de mergear o segundo. Foi o que prendeu os #111 a #113 em branches intermediárias (recuperados no #114).</w:t>
       </w:r>
     </w:p>
     <w:p>
       <w:pPr>
         <w:pStyle w:val="Heading1"/>
+        <w:spacing w:before="280" w:after="120"/>
       </w:pPr>
       <w:r>
         <w:t xml:space="preserve">3. Quem faz o quê</w:t>
@@ -682,7 +762,7 @@
         <w:spacing w:after="120"/>
       </w:pPr>
       <w:r>
-        <w:t xml:space="preserve">Em 2026-10-18 o 2dart5 assumiu também a Trilha C, que era do Enzo. O Enzo ficou com revisão, merge e as decisões da equipe.</w:t>
+        <w:t xml:space="preserve">Desde 2026-10-18 o 2dart5 cuida também da Trilha C. O Enzo fica com revisão, merge e as decisões da equipe.</w:t>
       </w:r>
     </w:p>
     <w:tbl>
@@ -698,10 +778,10 @@
         </w:tblBorders>
       </w:tblPr>
       <w:tblGrid>
-        <w:gridCol w:w="1900"/>
         <w:gridCol w:w="2000"/>
-        <w:gridCol w:w="2826"/>
-        <w:gridCol w:w="2300"/>
+        <w:gridCol w:w="2100"/>
+        <w:gridCol w:w="2600"/>
+        <w:gridCol w:w="2326"/>
       </w:tblGrid>
       <w:tr>
         <w:trPr>
@@ -709,7 +789,7 @@
         </w:trPr>
         <w:tc>
           <w:tcPr>
-            <w:tcW w:type="dxa" w:w="1900"/>
+            <w:tcW w:type="dxa" w:w="2000"/>
             <w:shd w:fill="EAEBFB" w:color="auto" w:val="clear"/>
             <w:tcMar>
               <w:top w:type="dxa" w:w="60"/>
@@ -730,7 +810,7 @@
         </w:tc>
         <w:tc>
           <w:tcPr>
-            <w:tcW w:type="dxa" w:w="2000"/>
+            <w:tcW w:type="dxa" w:w="2100"/>
             <w:shd w:fill="EAEBFB" w:color="auto" w:val="clear"/>
             <w:tcMar>
               <w:top w:type="dxa" w:w="60"/>
@@ -751,7 +831,7 @@
         </w:tc>
         <w:tc>
           <w:tcPr>
-            <w:tcW w:type="dxa" w:w="2826"/>
+            <w:tcW w:type="dxa" w:w="2600"/>
             <w:shd w:fill="EAEBFB" w:color="auto" w:val="clear"/>
             <w:tcMar>
               <w:top w:type="dxa" w:w="60"/>
@@ -772,7 +852,7 @@
         </w:tc>
         <w:tc>
           <w:tcPr>
-            <w:tcW w:type="dxa" w:w="2300"/>
+            <w:tcW w:type="dxa" w:w="2326"/>
             <w:shd w:fill="EAEBFB" w:color="auto" w:val="clear"/>
             <w:tcMar>
               <w:top w:type="dxa" w:w="60"/>
@@ -798,7 +878,7 @@
         </w:trPr>
         <w:tc>
           <w:tcPr>
-            <w:tcW w:type="dxa" w:w="1900"/>
+            <w:tcW w:type="dxa" w:w="2000"/>
             <w:tcMar>
               <w:top w:type="dxa" w:w="60"/>
               <w:left w:type="dxa" w:w="100"/>
@@ -814,6 +894,59 @@
         </w:tc>
         <w:tc>
           <w:tcPr>
+            <w:tcW w:type="dxa" w:w="2100"/>
+            <w:tcMar>
+              <w:top w:type="dxa" w:w="60"/>
+              <w:left w:type="dxa" w:w="100"/>
+              <w:bottom w:type="dxa" w:w="60"/>
+              <w:right w:type="dxa" w:w="100"/>
+            </w:tcMar>
+          </w:tcPr>
+          <w:p>
+            <w:r>
+              <w:t xml:space="preserve">A: domínio e financeiro</w:t>
+            </w:r>
+          </w:p>
+        </w:tc>
+        <w:tc>
+          <w:tcPr>
+            <w:tcW w:type="dxa" w:w="2600"/>
+            <w:tcMar>
+              <w:top w:type="dxa" w:w="60"/>
+              <w:left w:type="dxa" w:w="100"/>
+              <w:bottom w:type="dxa" w:w="60"/>
+              <w:right w:type="dxa" w:w="100"/>
+            </w:tcMar>
+          </w:tcPr>
+          <w:p>
+            <w:r>
+              <w:t xml:space="preserve">SPEC-006–009, 011, 020, 021, 024, 026 (rascunhos)</w:t>
+            </w:r>
+          </w:p>
+        </w:tc>
+        <w:tc>
+          <w:tcPr>
+            <w:tcW w:type="dxa" w:w="2326"/>
+            <w:tcMar>
+              <w:top w:type="dxa" w:w="60"/>
+              <w:left w:type="dxa" w:w="100"/>
+              <w:bottom w:type="dxa" w:w="60"/>
+              <w:right w:type="dxa" w:w="100"/>
+            </w:tcMar>
+          </w:tcPr>
+          <w:p>
+            <w:r>
+              <w:t xml:space="preserve">T-15, T-16, T-17, T-47, T-56, T-57, T-68</w:t>
+            </w:r>
+          </w:p>
+        </w:tc>
+      </w:tr>
+      <w:tr>
+        <w:trPr>
+          <w:tblHeader w:val="false"/>
+        </w:trPr>
+        <w:tc>
+          <w:tcPr>
             <w:tcW w:type="dxa" w:w="2000"/>
             <w:tcMar>
               <w:top w:type="dxa" w:w="60"/>
@@ -824,39 +957,55 @@
           </w:tcPr>
           <w:p>
             <w:r>
-              <w:t xml:space="preserve">A: domínio e financeiro</w:t>
-            </w:r>
-          </w:p>
-        </w:tc>
-        <w:tc>
-          <w:tcPr>
-            <w:tcW w:type="dxa" w:w="2826"/>
-            <w:tcMar>
-              <w:top w:type="dxa" w:w="60"/>
-              <w:left w:type="dxa" w:w="100"/>
-              <w:bottom w:type="dxa" w:w="60"/>
-              <w:right w:type="dxa" w:w="100"/>
-            </w:tcMar>
-          </w:tcPr>
-          <w:p>
-            <w:r>
-              <w:t xml:space="preserve">SPEC-001, 006–009, 011, 020, 021, 024, 026</w:t>
-            </w:r>
-          </w:p>
-        </w:tc>
-        <w:tc>
-          <w:tcPr>
-            <w:tcW w:type="dxa" w:w="2300"/>
-            <w:tcMar>
-              <w:top w:type="dxa" w:w="60"/>
-              <w:left w:type="dxa" w:w="100"/>
-              <w:bottom w:type="dxa" w:w="60"/>
-              <w:right w:type="dxa" w:w="100"/>
-            </w:tcMar>
-          </w:tcPr>
-          <w:p>
-            <w:r>
-              <w:t xml:space="preserve">T-07, T-15, T-16, T-17, T-47, T-56, T-57, T-68</w:t>
+              <w:t xml:space="preserve">2dart5</w:t>
+            </w:r>
+          </w:p>
+        </w:tc>
+        <w:tc>
+          <w:tcPr>
+            <w:tcW w:type="dxa" w:w="2100"/>
+            <w:tcMar>
+              <w:top w:type="dxa" w:w="60"/>
+              <w:left w:type="dxa" w:w="100"/>
+              <w:bottom w:type="dxa" w:w="60"/>
+              <w:right w:type="dxa" w:w="100"/>
+            </w:tcMar>
+          </w:tcPr>
+          <w:p>
+            <w:r>
+              <w:t xml:space="preserve">B: transação e consequência</w:t>
+            </w:r>
+          </w:p>
+        </w:tc>
+        <w:tc>
+          <w:tcPr>
+            <w:tcW w:type="dxa" w:w="2600"/>
+            <w:tcMar>
+              <w:top w:type="dxa" w:w="60"/>
+              <w:left w:type="dxa" w:w="100"/>
+              <w:bottom w:type="dxa" w:w="60"/>
+              <w:right w:type="dxa" w:w="100"/>
+            </w:tcMar>
+          </w:tcPr>
+          <w:p>
+            <w:r>
+              <w:t xml:space="preserve">SPEC-010, 012–019, 022, 023</w:t>
+            </w:r>
+          </w:p>
+        </w:tc>
+        <w:tc>
+          <w:tcPr>
+            <w:tcW w:type="dxa" w:w="2326"/>
+            <w:tcMar>
+              <w:top w:type="dxa" w:w="60"/>
+              <w:left w:type="dxa" w:w="100"/>
+              <w:bottom w:type="dxa" w:w="60"/>
+              <w:right w:type="dxa" w:w="100"/>
+            </w:tcMar>
+          </w:tcPr>
+          <w:p>
+            <w:r>
+              <w:t xml:space="preserve">T-22, T-23, T-28, T-29, T-33, T-53</w:t>
             </w:r>
           </w:p>
         </w:tc>
@@ -867,7 +1016,7 @@
         </w:trPr>
         <w:tc>
           <w:tcPr>
-            <w:tcW w:type="dxa" w:w="1900"/>
+            <w:tcW w:type="dxa" w:w="2000"/>
             <w:tcMar>
               <w:top w:type="dxa" w:w="60"/>
               <w:left w:type="dxa" w:w="100"/>
@@ -883,6 +1032,59 @@
         </w:tc>
         <w:tc>
           <w:tcPr>
+            <w:tcW w:type="dxa" w:w="2100"/>
+            <w:tcMar>
+              <w:top w:type="dxa" w:w="60"/>
+              <w:left w:type="dxa" w:w="100"/>
+              <w:bottom w:type="dxa" w:w="60"/>
+              <w:right w:type="dxa" w:w="100"/>
+            </w:tcMar>
+          </w:tcPr>
+          <w:p>
+            <w:r>
+              <w:t xml:space="preserve">C: acesso, admin e IA</w:t>
+            </w:r>
+          </w:p>
+        </w:tc>
+        <w:tc>
+          <w:tcPr>
+            <w:tcW w:type="dxa" w:w="2600"/>
+            <w:tcMar>
+              <w:top w:type="dxa" w:w="60"/>
+              <w:left w:type="dxa" w:w="100"/>
+              <w:bottom w:type="dxa" w:w="60"/>
+              <w:right w:type="dxa" w:w="100"/>
+            </w:tcMar>
+          </w:tcPr>
+          <w:p>
+            <w:r>
+              <w:t xml:space="preserve">SPEC-003–005, 025, 027–029</w:t>
+            </w:r>
+          </w:p>
+        </w:tc>
+        <w:tc>
+          <w:tcPr>
+            <w:tcW w:type="dxa" w:w="2326"/>
+            <w:tcMar>
+              <w:top w:type="dxa" w:w="60"/>
+              <w:left w:type="dxa" w:w="100"/>
+              <w:bottom w:type="dxa" w:w="60"/>
+              <w:right w:type="dxa" w:w="100"/>
+            </w:tcMar>
+          </w:tcPr>
+          <w:p>
+            <w:r>
+              <w:t xml:space="preserve">T-14, T-55, T-58, T-61, T-66, T-67</w:t>
+            </w:r>
+          </w:p>
+        </w:tc>
+      </w:tr>
+      <w:tr>
+        <w:trPr>
+          <w:tblHeader w:val="false"/>
+        </w:trPr>
+        <w:tc>
+          <w:tcPr>
             <w:tcW w:type="dxa" w:w="2000"/>
             <w:tcMar>
               <w:top w:type="dxa" w:w="60"/>
@@ -893,135 +1095,13 @@
           </w:tcPr>
           <w:p>
             <w:r>
-              <w:t xml:space="preserve">B: transação e consequência</w:t>
-            </w:r>
-          </w:p>
-        </w:tc>
-        <w:tc>
-          <w:tcPr>
-            <w:tcW w:type="dxa" w:w="2826"/>
-            <w:tcMar>
-              <w:top w:type="dxa" w:w="60"/>
-              <w:left w:type="dxa" w:w="100"/>
-              <w:bottom w:type="dxa" w:w="60"/>
-              <w:right w:type="dxa" w:w="100"/>
-            </w:tcMar>
-          </w:tcPr>
-          <w:p>
-            <w:r>
-              <w:t xml:space="preserve">SPEC-010, 012–019, 022, 023</w:t>
-            </w:r>
-          </w:p>
-        </w:tc>
-        <w:tc>
-          <w:tcPr>
-            <w:tcW w:type="dxa" w:w="2300"/>
-            <w:tcMar>
-              <w:top w:type="dxa" w:w="60"/>
-              <w:left w:type="dxa" w:w="100"/>
-              <w:bottom w:type="dxa" w:w="60"/>
-              <w:right w:type="dxa" w:w="100"/>
-            </w:tcMar>
-          </w:tcPr>
-          <w:p>
-            <w:r>
-              <w:t xml:space="preserve">T-22, T-23, T-28, T-29, T-33, T-53</w:t>
-            </w:r>
-          </w:p>
-        </w:tc>
-      </w:tr>
-      <w:tr>
-        <w:trPr>
-          <w:tblHeader w:val="false"/>
-        </w:trPr>
-        <w:tc>
-          <w:tcPr>
-            <w:tcW w:type="dxa" w:w="1900"/>
-            <w:tcMar>
-              <w:top w:type="dxa" w:w="60"/>
-              <w:left w:type="dxa" w:w="100"/>
-              <w:bottom w:type="dxa" w:w="60"/>
-              <w:right w:type="dxa" w:w="100"/>
-            </w:tcMar>
-          </w:tcPr>
-          <w:p>
-            <w:r>
-              <w:t xml:space="preserve">2dart5</w:t>
-            </w:r>
-          </w:p>
-        </w:tc>
-        <w:tc>
-          <w:tcPr>
-            <w:tcW w:type="dxa" w:w="2000"/>
-            <w:tcMar>
-              <w:top w:type="dxa" w:w="60"/>
-              <w:left w:type="dxa" w:w="100"/>
-              <w:bottom w:type="dxa" w:w="60"/>
-              <w:right w:type="dxa" w:w="100"/>
-            </w:tcMar>
-          </w:tcPr>
-          <w:p>
-            <w:r>
-              <w:t xml:space="preserve">C: acesso, admin e IA</w:t>
-            </w:r>
-          </w:p>
-        </w:tc>
-        <w:tc>
-          <w:tcPr>
-            <w:tcW w:type="dxa" w:w="2826"/>
-            <w:tcMar>
-              <w:top w:type="dxa" w:w="60"/>
-              <w:left w:type="dxa" w:w="100"/>
-              <w:bottom w:type="dxa" w:w="60"/>
-              <w:right w:type="dxa" w:w="100"/>
-            </w:tcMar>
-          </w:tcPr>
-          <w:p>
-            <w:r>
-              <w:t xml:space="preserve">SPEC-003–005, 025, 027–029</w:t>
-            </w:r>
-          </w:p>
-        </w:tc>
-        <w:tc>
-          <w:tcPr>
-            <w:tcW w:type="dxa" w:w="2300"/>
-            <w:tcMar>
-              <w:top w:type="dxa" w:w="60"/>
-              <w:left w:type="dxa" w:w="100"/>
-              <w:bottom w:type="dxa" w:w="60"/>
-              <w:right w:type="dxa" w:w="100"/>
-            </w:tcMar>
-          </w:tcPr>
-          <w:p>
-            <w:r>
-              <w:t xml:space="preserve">T-14, T-55, T-58, T-61, T-66, T-67</w:t>
-            </w:r>
-          </w:p>
-        </w:tc>
-      </w:tr>
-      <w:tr>
-        <w:trPr>
-          <w:tblHeader w:val="false"/>
-        </w:trPr>
-        <w:tc>
-          <w:tcPr>
-            <w:tcW w:type="dxa" w:w="1900"/>
-            <w:tcMar>
-              <w:top w:type="dxa" w:w="60"/>
-              <w:left w:type="dxa" w:w="100"/>
-              <w:bottom w:type="dxa" w:w="60"/>
-              <w:right w:type="dxa" w:w="100"/>
-            </w:tcMar>
-          </w:tcPr>
-          <w:p>
-            <w:r>
               <w:t xml:space="preserve">1Noriyuki (Enzo)</w:t>
             </w:r>
           </w:p>
         </w:tc>
         <w:tc>
           <w:tcPr>
-            <w:tcW w:type="dxa" w:w="2000"/>
+            <w:tcW w:type="dxa" w:w="2100"/>
             <w:tcMar>
               <w:top w:type="dxa" w:w="60"/>
               <w:left w:type="dxa" w:w="100"/>
@@ -1037,7 +1117,7 @@
         </w:tc>
         <w:tc>
           <w:tcPr>
-            <w:tcW w:type="dxa" w:w="2826"/>
+            <w:tcW w:type="dxa" w:w="2600"/>
             <w:tcMar>
               <w:top w:type="dxa" w:w="60"/>
               <w:left w:type="dxa" w:w="100"/>
@@ -1053,7 +1133,7 @@
         </w:tc>
         <w:tc>
           <w:tcPr>
-            <w:tcW w:type="dxa" w:w="2300"/>
+            <w:tcW w:type="dxa" w:w="2326"/>
             <w:tcMar>
               <w:top w:type="dxa" w:w="60"/>
               <w:left w:type="dxa" w:w="100"/>
@@ -1071,10 +1151,163 @@
     </w:tbl>
     <w:p>
       <w:pPr>
-        <w:spacing w:before="120" w:after="120"/>
-      </w:pPr>
-      <w:r>
-        <w:t xml:space="preserve">O colaborador </w:t>
+        <w:spacing w:after="60"/>
+      </w:pPr>
+    </w:p>
+    <w:p>
+      <w:pPr>
+        <w:spacing w:after="120"/>
+      </w:pPr>
+      <w:r>
+        <w:t xml:space="preserve">O colaborador niltonmack é o professor e não recebe issues.</w:t>
+      </w:r>
+    </w:p>
+    <w:p>
+      <w:pPr>
+        <w:pStyle w:val="Heading1"/>
+        <w:spacing w:before="280" w:after="120"/>
+      </w:pPr>
+      <w:r>
+        <w:t xml:space="preserve">4. O que cada um faz agora</w:t>
+      </w:r>
+    </w:p>
+    <w:p>
+      <w:pPr>
+        <w:pStyle w:val="Heading2"/>
+        <w:spacing w:before="200" w:after="100"/>
+      </w:pPr>
+      <w:r>
+        <w:t xml:space="preserve">gostislavs: levar os rascunhos à aprovação, um por vez</w:t>
+      </w:r>
+    </w:p>
+    <w:p>
+      <w:pPr>
+        <w:pStyle w:val="ListParagraph"/>
+        <w:numPr>
+          <w:ilvl w:val="0"/>
+          <w:numId w:val="3"/>
+        </w:numPr>
+        <w:spacing w:after="60"/>
+      </w:pPr>
+      <w:r>
+        <w:rPr>
+          <w:b/>
+          <w:bCs/>
+        </w:rPr>
+        <w:t xml:space="preserve">SPEC-006 primeiro</w:t>
+      </w:r>
+      <w:r>
+        <w:t xml:space="preserve"> (reputação). Levar ao Enzo as questões da §13 antes de implementar mais nada dela.</w:t>
+      </w:r>
+    </w:p>
+    <w:p>
+      <w:pPr>
+        <w:pStyle w:val="ListParagraph"/>
+        <w:numPr>
+          <w:ilvl w:val="0"/>
+          <w:numId w:val="3"/>
+        </w:numPr>
+        <w:spacing w:after="60"/>
+      </w:pPr>
+      <w:r>
+        <w:t xml:space="preserve">Depois a SPEC-007 e a SPEC-008. A </w:t>
+      </w:r>
+      <w:r>
+        <w:rPr>
+          <w:b/>
+          <w:bCs/>
+        </w:rPr>
+        <w:t xml:space="preserve">SPEC-008 tem tela</w:t>
+      </w:r>
+      <w:r>
+        <w:t xml:space="preserve"> (simulador da régua): precisa de layout antes da aprovação.</w:t>
+      </w:r>
+    </w:p>
+    <w:p>
+      <w:pPr>
+        <w:pStyle w:val="ListParagraph"/>
+        <w:numPr>
+          <w:ilvl w:val="0"/>
+          <w:numId w:val="3"/>
+        </w:numPr>
+        <w:spacing w:after="60"/>
+      </w:pPr>
+      <w:r>
+        <w:t xml:space="preserve">Nos rascunhos, deixar o status explícito como "Rascunho — aguardando aprovação", como já está na SPEC-006. Os outros oito dizem só "derivada da baseline", o que pode ser lido como pronta.</w:t>
+      </w:r>
+    </w:p>
+    <w:p>
+      <w:pPr>
+        <w:pStyle w:val="ListParagraph"/>
+        <w:numPr>
+          <w:ilvl w:val="0"/>
+          <w:numId w:val="3"/>
+        </w:numPr>
+        <w:spacing w:after="60"/>
+      </w:pPr>
+      <w:r>
+        <w:t xml:space="preserve">Pendência conhecida para a SPEC-020: agendamentos confirmados antes do #124 não têm o prazo da P-17 gravado e releem o valor atual. Decidir se a migração preenche essas linhas.</w:t>
+      </w:r>
+    </w:p>
+    <w:p>
+      <w:pPr>
+        <w:pStyle w:val="Heading2"/>
+        <w:spacing w:before="200" w:after="100"/>
+      </w:pPr>
+      <w:r>
+        <w:t xml:space="preserve">2dart5: conferir as SPEC-003, 004 e 005</w:t>
+      </w:r>
+    </w:p>
+    <w:p>
+      <w:pPr>
+        <w:pStyle w:val="ListParagraph"/>
+        <w:numPr>
+          <w:ilvl w:val="0"/>
+          <w:numId w:val="3"/>
+        </w:numPr>
+        <w:spacing w:after="60"/>
+      </w:pPr>
+      <w:r>
+        <w:t xml:space="preserve">SPEC-003 (autorização e titularidade): testes T-AUTORIZ-01 a 05 e T-TITULAR-01 a 03.</w:t>
+      </w:r>
+    </w:p>
+    <w:p>
+      <w:pPr>
+        <w:pStyle w:val="ListParagraph"/>
+        <w:numPr>
+          <w:ilvl w:val="0"/>
+          <w:numId w:val="3"/>
+        </w:numPr>
+        <w:spacing w:after="60"/>
+      </w:pPr>
+      <w:r>
+        <w:t xml:space="preserve">SPEC-004 (notificações): testes T-NOTIF-01 a 08; fecha a T-66.</w:t>
+      </w:r>
+    </w:p>
+    <w:p>
+      <w:pPr>
+        <w:pStyle w:val="ListParagraph"/>
+        <w:numPr>
+          <w:ilvl w:val="0"/>
+          <w:numId w:val="3"/>
+        </w:numPr>
+        <w:spacing w:after="60"/>
+      </w:pPr>
+      <w:r>
+        <w:t xml:space="preserve">SPEC-005 (aprovação de prestador): testes T-MODERACAO-01 a 04 e T-CONTA-02a a 02d; fecha a T-14.</w:t>
+      </w:r>
+    </w:p>
+    <w:p>
+      <w:pPr>
+        <w:pStyle w:val="ListParagraph"/>
+        <w:numPr>
+          <w:ilvl w:val="0"/>
+          <w:numId w:val="3"/>
+        </w:numPr>
+        <w:spacing w:after="60"/>
+      </w:pPr>
+      <w:r>
+        <w:t xml:space="preserve">Seguir o modelo da SPEC-001: tabela de evidência na seção 12 e PR com </w:t>
       </w:r>
       <w:r>
         <w:rPr>
@@ -1082,34 +1315,10 @@
           <w:sz w:val="19"/>
           <w:szCs w:val="19"/>
         </w:rPr>
-        <w:t xml:space="preserve">niltonmack</w:t>
-      </w:r>
-      <w:r>
-        <w:t xml:space="preserve"> é o professor e não recebe issues.</w:t>
-      </w:r>
-    </w:p>
-    <w:p>
-      <w:pPr>
-        <w:pStyle w:val="Heading1"/>
-      </w:pPr>
-      <w:r>
-        <w:t xml:space="preserve">4. O que cada um faz agora</w:t>
-      </w:r>
-    </w:p>
-    <w:p>
-      <w:pPr>
-        <w:pStyle w:val="Heading2"/>
-      </w:pPr>
-      <w:r>
-        <w:t xml:space="preserve">gostislavs: as oito correções da SPEC-001</w:t>
-      </w:r>
-    </w:p>
-    <w:p>
-      <w:pPr>
-        <w:spacing w:after="120"/>
-      </w:pPr>
-      <w:r>
-        <w:t xml:space="preserve">As decisões sobre os pedidos A a E já estão na spec v0.1.7 e na SPEC-001 v1.1.0. O código ainda deve estas correções, detalhadas em </w:t>
+        <w:t xml:space="preserve">Closes #82</w:t>
+      </w:r>
+      <w:r>
+        <w:t xml:space="preserve">, </w:t>
       </w:r>
       <w:r>
         <w:rPr>
@@ -1117,10 +1326,38 @@
           <w:sz w:val="19"/>
           <w:szCs w:val="19"/>
         </w:rPr>
-        <w:t xml:space="preserve">docs/specs/propostas-decisoes-trilha-a.md</w:t>
-      </w:r>
-      <w:r>
-        <w:t xml:space="preserve">:</w:t>
+        <w:t xml:space="preserve">#83</w:t>
+      </w:r>
+      <w:r>
+        <w:t xml:space="preserve"> e </w:t>
+      </w:r>
+      <w:r>
+        <w:rPr>
+          <w:rFonts w:ascii="Consolas" w:cs="Consolas" w:eastAsia="Consolas" w:hAnsi="Consolas"/>
+          <w:sz w:val="19"/>
+          <w:szCs w:val="19"/>
+        </w:rPr>
+        <w:t xml:space="preserve">#84</w:t>
+      </w:r>
+      <w:r>
+        <w:t xml:space="preserve">. As questões da §13 vão ao Enzo antes de mudar comportamento.</w:t>
+      </w:r>
+    </w:p>
+    <w:p>
+      <w:pPr>
+        <w:spacing w:after="120"/>
+      </w:pPr>
+      <w:r>
+        <w:t xml:space="preserve">Depois, na Trilha B, a primeira da fila é a SPEC-010.</w:t>
+      </w:r>
+    </w:p>
+    <w:p>
+      <w:pPr>
+        <w:pStyle w:val="Heading2"/>
+        <w:spacing w:before="200" w:after="100"/>
+      </w:pPr>
+      <w:r>
+        <w:t xml:space="preserve">Enzo: merge, revisão e decisões</w:t>
       </w:r>
     </w:p>
     <w:p>
@@ -1133,7 +1370,7 @@
         <w:spacing w:after="60"/>
       </w:pPr>
       <w:r>
-        <w:t xml:space="preserve">P-07 aceita 0,5 h (hoje o mínimo é 1 h e o valor é inteiro).</w:t>
+        <w:t xml:space="preserve">Aprovar os rascunhos da Trilha A, um por vez, começando pela SPEC-006.</w:t>
       </w:r>
     </w:p>
     <w:p>
@@ -1146,29 +1383,7 @@
         <w:spacing w:after="60"/>
       </w:pPr>
       <w:r>
-        <w:t xml:space="preserve">Remover </w:t>
-      </w:r>
-      <w:r>
-        <w:rPr>
-          <w:rFonts w:ascii="Consolas" w:cs="Consolas" w:eastAsia="Consolas" w:hAnsi="Consolas"/>
-          <w:sz w:val="19"/>
-          <w:szCs w:val="19"/>
-        </w:rPr>
-        <w:t xml:space="preserve">RASCUNHO</w:t>
-      </w:r>
-      <w:r>
-        <w:t xml:space="preserve"> da máquina do horário e do </w:t>
-      </w:r>
-      <w:r>
-        <w:rPr>
-          <w:rFonts w:ascii="Consolas" w:cs="Consolas" w:eastAsia="Consolas" w:hAnsi="Consolas"/>
-          <w:sz w:val="19"/>
-          <w:szCs w:val="19"/>
-        </w:rPr>
-        <w:t xml:space="preserve">CHECK</w:t>
-      </w:r>
-      <w:r>
-        <w:t xml:space="preserve"> do banco.</w:t>
+        <w:t xml:space="preserve">Revisar e mergear os PRs da equipe. Ninguém mergeia o próprio PR (constituição, princípio X).</w:t>
       </w:r>
     </w:p>
     <w:p>
@@ -1181,274 +1396,13 @@
         <w:spacing w:after="60"/>
       </w:pPr>
       <w:r>
-        <w:t xml:space="preserve">Remover </w:t>
-      </w:r>
-      <w:r>
-        <w:rPr>
-          <w:rFonts w:ascii="Consolas" w:cs="Consolas" w:eastAsia="Consolas" w:hAnsi="Consolas"/>
-          <w:sz w:val="19"/>
-          <w:szCs w:val="19"/>
-        </w:rPr>
-        <w:t xml:space="preserve">BLOQUEADO → CANCELADO</w:t>
-      </w:r>
-      <w:r>
-        <w:t xml:space="preserve"> e </w:t>
-      </w:r>
-      <w:r>
-        <w:rPr>
-          <w:rFonts w:ascii="Consolas" w:cs="Consolas" w:eastAsia="Consolas" w:hAnsi="Consolas"/>
-          <w:sz w:val="19"/>
-          <w:szCs w:val="19"/>
-        </w:rPr>
-        <w:t xml:space="preserve">EM_REVISAO → RESTRITO</w:t>
-      </w:r>
-      <w:r>
-        <w:t xml:space="preserve">, que nenhum caso de uso usa.</w:t>
-      </w:r>
-    </w:p>
-    <w:p>
-      <w:pPr>
-        <w:pStyle w:val="ListParagraph"/>
-        <w:numPr>
-          <w:ilvl w:val="0"/>
-          <w:numId w:val="3"/>
-        </w:numPr>
-        <w:spacing w:after="60"/>
-      </w:pPr>
-      <w:r>
-        <w:t xml:space="preserve">Perfil novo nasce com o padrão global de P-01 e P-02, não com o valor fixo do esquema.</w:t>
-      </w:r>
-    </w:p>
-    <w:p>
-      <w:pPr>
-        <w:pStyle w:val="ListParagraph"/>
-        <w:numPr>
-          <w:ilvl w:val="0"/>
-          <w:numId w:val="3"/>
-        </w:numPr>
-        <w:spacing w:after="60"/>
-      </w:pPr>
-      <w:r>
-        <w:t xml:space="preserve">Deltas de reputação viram o parâmetro P-22 (metade ao dobro do padrão, mesmo sinal, prestador nunca abaixo do cliente).</w:t>
-      </w:r>
-    </w:p>
-    <w:p>
-      <w:pPr>
-        <w:pStyle w:val="ListParagraph"/>
-        <w:numPr>
-          <w:ilvl w:val="0"/>
-          <w:numId w:val="3"/>
-        </w:numPr>
-        <w:spacing w:after="60"/>
-      </w:pPr>
-      <w:r>
-        <w:t xml:space="preserve">Máquina de estados do </w:t>
-      </w:r>
-      <w:r>
-        <w:rPr>
-          <w:rFonts w:ascii="Consolas" w:cs="Consolas" w:eastAsia="Consolas" w:hAnsi="Consolas"/>
-          <w:sz w:val="19"/>
-          <w:szCs w:val="19"/>
-        </w:rPr>
-        <w:t xml:space="preserve">LancamentoComissao</w:t>
-      </w:r>
-      <w:r>
-        <w:t xml:space="preserve">, com </w:t>
-      </w:r>
-      <w:r>
-        <w:rPr>
-          <w:rFonts w:ascii="Consolas" w:cs="Consolas" w:eastAsia="Consolas" w:hAnsi="Consolas"/>
-          <w:sz w:val="19"/>
-          <w:szCs w:val="19"/>
-        </w:rPr>
-        <w:t xml:space="preserve">assegurarTransicao</w:t>
-      </w:r>
-      <w:r>
-        <w:t xml:space="preserve"> e auditoria.</w:t>
-      </w:r>
-    </w:p>
-    <w:p>
-      <w:pPr>
-        <w:pStyle w:val="ListParagraph"/>
-        <w:numPr>
-          <w:ilvl w:val="0"/>
-          <w:numId w:val="3"/>
-        </w:numPr>
-        <w:spacing w:after="60"/>
-      </w:pPr>
-      <w:r>
-        <w:t xml:space="preserve">Conferir se a conclusão automática grava o prazo de P-17 ou relê o valor atual.</w:t>
-      </w:r>
-    </w:p>
-    <w:p>
-      <w:pPr>
-        <w:pStyle w:val="ListParagraph"/>
-        <w:numPr>
-          <w:ilvl w:val="0"/>
-          <w:numId w:val="3"/>
-        </w:numPr>
-        <w:spacing w:after="60"/>
-      </w:pPr>
-      <w:r>
-        <w:t xml:space="preserve">Reescrever o </w:t>
-      </w:r>
-      <w:r>
-        <w:rPr>
-          <w:rFonts w:ascii="Consolas" w:cs="Consolas" w:eastAsia="Consolas" w:hAnsi="Consolas"/>
-          <w:sz w:val="19"/>
-          <w:szCs w:val="19"/>
-        </w:rPr>
-        <w:t xml:space="preserve">T-PARAM-05</w:t>
-      </w:r>
-      <w:r>
-        <w:t xml:space="preserve"> para o novo CA-05.</w:t>
-      </w:r>
-    </w:p>
-    <w:p>
-      <w:pPr>
-        <w:spacing w:before="120" w:after="120"/>
-      </w:pPr>
-      <w:r>
-        <w:t xml:space="preserve">Com isso feito e os CA-05, 08, 09, 10 e 11 conferidos, fecham a #80 e a #9. Em seguida vem a geração da SPEC-006.</w:t>
+        <w:t xml:space="preserve">Responder às questões da §13 das SPEC-003 a 005 quando o 2dart5 chegar nelas.</w:t>
       </w:r>
     </w:p>
     <w:p>
       <w:pPr>
         <w:pStyle w:val="Heading2"/>
-      </w:pPr>
-      <w:r>
-        <w:t xml:space="preserve">2dart5: conferir as SPEC-003, 004 e 005</w:t>
-      </w:r>
-    </w:p>
-    <w:p>
-      <w:pPr>
-        <w:pStyle w:val="ListParagraph"/>
-        <w:numPr>
-          <w:ilvl w:val="0"/>
-          <w:numId w:val="4"/>
-        </w:numPr>
-        <w:spacing w:after="60"/>
-      </w:pPr>
-      <w:r>
-        <w:rPr>
-          <w:b/>
-          <w:bCs/>
-        </w:rPr>
-        <w:t xml:space="preserve">SPEC-003</w:t>
-      </w:r>
-      <w:r>
-        <w:t xml:space="preserve"> (autorização e titularidade): testes T-AUTORIZ-01 a 05 e T-TITULAR-01 a 03.</w:t>
-      </w:r>
-    </w:p>
-    <w:p>
-      <w:pPr>
-        <w:pStyle w:val="ListParagraph"/>
-        <w:numPr>
-          <w:ilvl w:val="0"/>
-          <w:numId w:val="4"/>
-        </w:numPr>
-        <w:spacing w:after="60"/>
-      </w:pPr>
-      <w:r>
-        <w:rPr>
-          <w:b/>
-          <w:bCs/>
-        </w:rPr>
-        <w:t xml:space="preserve">SPEC-004</w:t>
-      </w:r>
-      <w:r>
-        <w:t xml:space="preserve"> (notificações): testes T-NOTIF-01 a 08; fecha a T-66.</w:t>
-      </w:r>
-    </w:p>
-    <w:p>
-      <w:pPr>
-        <w:pStyle w:val="ListParagraph"/>
-        <w:numPr>
-          <w:ilvl w:val="0"/>
-          <w:numId w:val="4"/>
-        </w:numPr>
-        <w:spacing w:after="60"/>
-      </w:pPr>
-      <w:r>
-        <w:rPr>
-          <w:b/>
-          <w:bCs/>
-        </w:rPr>
-        <w:t xml:space="preserve">SPEC-005</w:t>
-      </w:r>
-      <w:r>
-        <w:t xml:space="preserve"> (aprovação de prestador): testes T-MODERACAO-01 a 04 e T-CONTA-02a a 02d; fecha a T-14.</w:t>
-      </w:r>
-    </w:p>
-    <w:p>
-      <w:pPr>
-        <w:pStyle w:val="ListParagraph"/>
-        <w:numPr>
-          <w:ilvl w:val="0"/>
-          <w:numId w:val="4"/>
-        </w:numPr>
-        <w:spacing w:after="60"/>
-      </w:pPr>
-      <w:r>
-        <w:t xml:space="preserve">Cada Spec tem questões na §13 que dependem da equipe. Leve-as ao Enzo antes de mexer no comportamento.</w:t>
-      </w:r>
-    </w:p>
-    <w:p>
-      <w:pPr>
-        <w:spacing w:before="120" w:after="120"/>
-      </w:pPr>
-      <w:r>
-        <w:t xml:space="preserve">Depois, na Trilha B, a primeira da fila é a SPEC-010. As tarefas T-22, T-23, T-28, T-29, T-33 e T-53 já têm testes em </w:t>
-      </w:r>
-      <w:r>
-        <w:rPr>
-          <w:rFonts w:ascii="Consolas" w:cs="Consolas" w:eastAsia="Consolas" w:hAnsi="Consolas"/>
-          <w:sz w:val="19"/>
-          <w:szCs w:val="19"/>
-        </w:rPr>
-        <w:t xml:space="preserve">trilha-b.test.js</w:t>
-      </w:r>
-      <w:r>
-        <w:t xml:space="preserve"> e esperam as Specs delas.</w:t>
-      </w:r>
-    </w:p>
-    <w:p>
-      <w:pPr>
-        <w:pStyle w:val="Heading2"/>
-      </w:pPr>
-      <w:r>
-        <w:t xml:space="preserve">Enzo: merge, revisão e decisões</w:t>
-      </w:r>
-    </w:p>
-    <w:p>
-      <w:pPr>
-        <w:pStyle w:val="ListParagraph"/>
-        <w:numPr>
-          <w:ilvl w:val="0"/>
-          <w:numId w:val="4"/>
-        </w:numPr>
-        <w:spacing w:after="60"/>
-      </w:pPr>
-      <w:r>
-        <w:t xml:space="preserve">Revisar e mergear os PRs da equipe. Ninguém mergeia o próprio PR (constituição, princípio X).</w:t>
-      </w:r>
-    </w:p>
-    <w:p>
-      <w:pPr>
-        <w:pStyle w:val="ListParagraph"/>
-        <w:numPr>
-          <w:ilvl w:val="0"/>
-          <w:numId w:val="4"/>
-        </w:numPr>
-        <w:spacing w:after="60"/>
-      </w:pPr>
-      <w:r>
-        <w:t xml:space="preserve">Responder às questões da §13 das SPEC-003 a 005 quando o 2dart5 chegar nelas.</w:t>
-      </w:r>
-    </w:p>
-    <w:p>
-      <w:pPr>
-        <w:pStyle w:val="Heading2"/>
+        <w:spacing w:before="200" w:after="100"/>
       </w:pPr>
       <w:r>
         <w:t xml:space="preserve">Ordem e paralelismo</w:t>
@@ -1467,9 +1421,9 @@
         </w:tblBorders>
       </w:tblPr>
       <w:tblGrid>
-        <w:gridCol w:w="1300"/>
-        <w:gridCol w:w="2400"/>
-        <w:gridCol w:w="5326"/>
+        <w:gridCol w:w="1500"/>
+        <w:gridCol w:w="2600"/>
+        <w:gridCol w:w="4926"/>
       </w:tblGrid>
       <w:tr>
         <w:trPr>
@@ -1477,7 +1431,7 @@
         </w:trPr>
         <w:tc>
           <w:tcPr>
-            <w:tcW w:type="dxa" w:w="1300"/>
+            <w:tcW w:type="dxa" w:w="1500"/>
             <w:shd w:fill="EAEBFB" w:color="auto" w:val="clear"/>
             <w:tcMar>
               <w:top w:type="dxa" w:w="60"/>
@@ -1498,7 +1452,7 @@
         </w:tc>
         <w:tc>
           <w:tcPr>
-            <w:tcW w:type="dxa" w:w="2400"/>
+            <w:tcW w:type="dxa" w:w="2600"/>
             <w:shd w:fill="EAEBFB" w:color="auto" w:val="clear"/>
             <w:tcMar>
               <w:top w:type="dxa" w:w="60"/>
@@ -1519,7 +1473,7 @@
         </w:tc>
         <w:tc>
           <w:tcPr>
-            <w:tcW w:type="dxa" w:w="5326"/>
+            <w:tcW w:type="dxa" w:w="4926"/>
             <w:shd w:fill="EAEBFB" w:color="auto" w:val="clear"/>
             <w:tcMar>
               <w:top w:type="dxa" w:w="60"/>
@@ -1545,7 +1499,7 @@
         </w:trPr>
         <w:tc>
           <w:tcPr>
-            <w:tcW w:type="dxa" w:w="1300"/>
+            <w:tcW w:type="dxa" w:w="1500"/>
             <w:tcMar>
               <w:top w:type="dxa" w:w="60"/>
               <w:left w:type="dxa" w:w="100"/>
@@ -1561,7 +1515,7 @@
         </w:tc>
         <w:tc>
           <w:tcPr>
-            <w:tcW w:type="dxa" w:w="2400"/>
+            <w:tcW w:type="dxa" w:w="2600"/>
             <w:tcMar>
               <w:top w:type="dxa" w:w="60"/>
               <w:left w:type="dxa" w:w="100"/>
@@ -1577,17 +1531,17 @@
         </w:tc>
         <w:tc>
           <w:tcPr>
-            <w:tcW w:type="dxa" w:w="5326"/>
-            <w:tcMar>
-              <w:top w:type="dxa" w:w="60"/>
-              <w:left w:type="dxa" w:w="100"/>
-              <w:bottom w:type="dxa" w:w="60"/>
-              <w:right w:type="dxa" w:w="100"/>
-            </w:tcMar>
-          </w:tcPr>
-          <w:p>
-            <w:r>
-              <w:t xml:space="preserve">Correções da SPEC-001 · conferência das SPEC-003 a 005 · revisão dos PRs</w:t>
+            <w:tcW w:type="dxa" w:w="4926"/>
+            <w:tcMar>
+              <w:top w:type="dxa" w:w="60"/>
+              <w:left w:type="dxa" w:w="100"/>
+              <w:bottom w:type="dxa" w:w="60"/>
+              <w:right w:type="dxa" w:w="100"/>
+            </w:tcMar>
+          </w:tcPr>
+          <w:p>
+            <w:r>
+              <w:t xml:space="preserve">Aprovação da SPEC-006 · conferência das SPEC-003 a 005 · revisão dos PRs</w:t>
             </w:r>
           </w:p>
         </w:tc>
@@ -1598,7 +1552,7 @@
         </w:trPr>
         <w:tc>
           <w:tcPr>
-            <w:tcW w:type="dxa" w:w="1300"/>
+            <w:tcW w:type="dxa" w:w="1500"/>
             <w:tcMar>
               <w:top w:type="dxa" w:w="60"/>
               <w:left w:type="dxa" w:w="100"/>
@@ -1614,7 +1568,7 @@
         </w:tc>
         <w:tc>
           <w:tcPr>
-            <w:tcW w:type="dxa" w:w="2400"/>
+            <w:tcW w:type="dxa" w:w="2600"/>
             <w:tcMar>
               <w:top w:type="dxa" w:w="60"/>
               <w:left w:type="dxa" w:w="100"/>
@@ -1630,17 +1584,17 @@
         </w:tc>
         <w:tc>
           <w:tcPr>
-            <w:tcW w:type="dxa" w:w="5326"/>
-            <w:tcMar>
-              <w:top w:type="dxa" w:w="60"/>
-              <w:left w:type="dxa" w:w="100"/>
-              <w:bottom w:type="dxa" w:w="60"/>
-              <w:right w:type="dxa" w:w="100"/>
-            </w:tcMar>
-          </w:tcPr>
-          <w:p>
-            <w:r>
-              <w:t xml:space="preserve">SPEC-006, 007 e 008</w:t>
+            <w:tcW w:type="dxa" w:w="4926"/>
+            <w:tcMar>
+              <w:top w:type="dxa" w:w="60"/>
+              <w:left w:type="dxa" w:w="100"/>
+              <w:bottom w:type="dxa" w:w="60"/>
+              <w:right w:type="dxa" w:w="100"/>
+            </w:tcMar>
+          </w:tcPr>
+          <w:p>
+            <w:r>
+              <w:t xml:space="preserve">SPEC-007 e 008 (rascunhos já escritos)</w:t>
             </w:r>
           </w:p>
         </w:tc>
@@ -1651,7 +1605,7 @@
         </w:trPr>
         <w:tc>
           <w:tcPr>
-            <w:tcW w:type="dxa" w:w="1300"/>
+            <w:tcW w:type="dxa" w:w="1500"/>
             <w:tcMar>
               <w:top w:type="dxa" w:w="60"/>
               <w:left w:type="dxa" w:w="100"/>
@@ -1667,7 +1621,7 @@
         </w:tc>
         <w:tc>
           <w:tcPr>
-            <w:tcW w:type="dxa" w:w="2400"/>
+            <w:tcW w:type="dxa" w:w="2600"/>
             <w:tcMar>
               <w:top w:type="dxa" w:w="60"/>
               <w:left w:type="dxa" w:w="100"/>
@@ -1683,7 +1637,7 @@
         </w:tc>
         <w:tc>
           <w:tcPr>
-            <w:tcW w:type="dxa" w:w="5326"/>
+            <w:tcW w:type="dxa" w:w="4926"/>
             <w:tcMar>
               <w:top w:type="dxa" w:w="60"/>
               <w:left w:type="dxa" w:w="100"/>
@@ -1704,7 +1658,7 @@
         </w:trPr>
         <w:tc>
           <w:tcPr>
-            <w:tcW w:type="dxa" w:w="1300"/>
+            <w:tcW w:type="dxa" w:w="1500"/>
             <w:tcMar>
               <w:top w:type="dxa" w:w="60"/>
               <w:left w:type="dxa" w:w="100"/>
@@ -1720,7 +1674,7 @@
         </w:tc>
         <w:tc>
           <w:tcPr>
-            <w:tcW w:type="dxa" w:w="2400"/>
+            <w:tcW w:type="dxa" w:w="2600"/>
             <w:tcMar>
               <w:top w:type="dxa" w:w="60"/>
               <w:left w:type="dxa" w:w="100"/>
@@ -1736,7 +1690,7 @@
         </w:tc>
         <w:tc>
           <w:tcPr>
-            <w:tcW w:type="dxa" w:w="5326"/>
+            <w:tcW w:type="dxa" w:w="4926"/>
             <w:tcMar>
               <w:top w:type="dxa" w:w="60"/>
               <w:left w:type="dxa" w:w="100"/>
@@ -1757,7 +1711,7 @@
         </w:trPr>
         <w:tc>
           <w:tcPr>
-            <w:tcW w:type="dxa" w:w="1300"/>
+            <w:tcW w:type="dxa" w:w="1500"/>
             <w:tcMar>
               <w:top w:type="dxa" w:w="60"/>
               <w:left w:type="dxa" w:w="100"/>
@@ -1773,7 +1727,7 @@
         </w:tc>
         <w:tc>
           <w:tcPr>
-            <w:tcW w:type="dxa" w:w="2400"/>
+            <w:tcW w:type="dxa" w:w="2600"/>
             <w:tcMar>
               <w:top w:type="dxa" w:w="60"/>
               <w:left w:type="dxa" w:w="100"/>
@@ -1789,7 +1743,7 @@
         </w:tc>
         <w:tc>
           <w:tcPr>
-            <w:tcW w:type="dxa" w:w="5326"/>
+            <w:tcW w:type="dxa" w:w="4926"/>
             <w:tcMar>
               <w:top w:type="dxa" w:w="60"/>
               <w:left w:type="dxa" w:w="100"/>
@@ -1810,7 +1764,7 @@
         </w:trPr>
         <w:tc>
           <w:tcPr>
-            <w:tcW w:type="dxa" w:w="1300"/>
+            <w:tcW w:type="dxa" w:w="1500"/>
             <w:tcMar>
               <w:top w:type="dxa" w:w="60"/>
               <w:left w:type="dxa" w:w="100"/>
@@ -1826,7 +1780,7 @@
         </w:tc>
         <w:tc>
           <w:tcPr>
-            <w:tcW w:type="dxa" w:w="2400"/>
+            <w:tcW w:type="dxa" w:w="2600"/>
             <w:tcMar>
               <w:top w:type="dxa" w:w="60"/>
               <w:left w:type="dxa" w:w="100"/>
@@ -1842,7 +1796,7 @@
         </w:tc>
         <w:tc>
           <w:tcPr>
-            <w:tcW w:type="dxa" w:w="5326"/>
+            <w:tcW w:type="dxa" w:w="4926"/>
             <w:tcMar>
               <w:top w:type="dxa" w:w="60"/>
               <w:left w:type="dxa" w:w="100"/>
@@ -1861,17 +1815,10 @@
     <w:p>
       <w:pPr>
         <w:pStyle w:val="Heading1"/>
-      </w:pPr>
-      <w:r>
-        <w:t xml:space="preserve">5. Decisões da SPEC-002 (2026-10-20)</w:t>
-      </w:r>
-    </w:p>
-    <w:p>
-      <w:pPr>
-        <w:spacing w:after="120"/>
-      </w:pPr>
-      <w:r>
-        <w:t xml:space="preserve">Decididas pelo Enzo, já na spec v0.1.8 e na SPEC-002 v1.3.0 (registro, etapa 24). As correções de código citadas abaixo já estão feitas e testadas.</w:t>
+        <w:spacing w:before="280" w:after="120"/>
+      </w:pPr>
+      <w:r>
+        <w:t xml:space="preserve">5. O que mudou desde 2026-10-20</w:t>
       </w:r>
     </w:p>
     <w:tbl>
@@ -1887,8 +1834,8 @@
         </w:tblBorders>
       </w:tblPr>
       <w:tblGrid>
-        <w:gridCol w:w="2500"/>
-        <w:gridCol w:w="6526"/>
+        <w:gridCol w:w="2300"/>
+        <w:gridCol w:w="6726"/>
       </w:tblGrid>
       <w:tr>
         <w:trPr>
@@ -1896,7 +1843,7 @@
         </w:trPr>
         <w:tc>
           <w:tcPr>
-            <w:tcW w:type="dxa" w:w="2500"/>
+            <w:tcW w:type="dxa" w:w="2300"/>
             <w:shd w:fill="EAEBFB" w:color="auto" w:val="clear"/>
             <w:tcMar>
               <w:top w:type="dxa" w:w="60"/>
@@ -1911,13 +1858,13 @@
                 <w:b/>
                 <w:bCs/>
               </w:rPr>
-              <w:t xml:space="preserve">Questão</w:t>
-            </w:r>
-          </w:p>
-        </w:tc>
-        <w:tc>
-          <w:tcPr>
-            <w:tcW w:type="dxa" w:w="6526"/>
+              <w:t xml:space="preserve">Etapa</w:t>
+            </w:r>
+          </w:p>
+        </w:tc>
+        <w:tc>
+          <w:tcPr>
+            <w:tcW w:type="dxa" w:w="6726"/>
             <w:shd w:fill="EAEBFB" w:color="auto" w:val="clear"/>
             <w:tcMar>
               <w:top w:type="dxa" w:w="60"/>
@@ -1932,7 +1879,7 @@
                 <w:b/>
                 <w:bCs/>
               </w:rPr>
-              <w:t xml:space="preserve">Decisão</w:t>
+              <w:t xml:space="preserve">O que foi feito</w:t>
             </w:r>
           </w:p>
         </w:tc>
@@ -1943,191 +1890,33 @@
         </w:trPr>
         <w:tc>
           <w:tcPr>
-            <w:tcW w:type="dxa" w:w="2500"/>
-            <w:tcMar>
-              <w:top w:type="dxa" w:w="60"/>
-              <w:left w:type="dxa" w:w="100"/>
-              <w:bottom w:type="dxa" w:w="60"/>
-              <w:right w:type="dxa" w:w="100"/>
-            </w:tcMar>
-          </w:tcPr>
-          <w:p>
-            <w:r>
-              <w:t xml:space="preserve">OPEN-201: política de senha</w:t>
-            </w:r>
-          </w:p>
-        </w:tc>
-        <w:tc>
-          <w:tcPr>
-            <w:tcW w:type="dxa" w:w="6526"/>
-            <w:tcMar>
-              <w:top w:type="dxa" w:w="60"/>
-              <w:left w:type="dxa" w:w="100"/>
-              <w:bottom w:type="dxa" w:w="60"/>
-              <w:right w:type="dxa" w:w="100"/>
-            </w:tcMar>
-          </w:tcPr>
-          <w:p>
-            <w:r>
-              <w:t xml:space="preserve">Na RF-001: mínimo de 8 caracteres, misturando letras e números. Não é parâmetro, para o admin não poder baixar um piso de segurança</w:t>
-            </w:r>
-          </w:p>
-        </w:tc>
-      </w:tr>
-      <w:tr>
-        <w:trPr>
-          <w:tblHeader w:val="false"/>
-        </w:trPr>
-        <w:tc>
-          <w:tcPr>
-            <w:tcW w:type="dxa" w:w="2500"/>
-            <w:tcMar>
-              <w:top w:type="dxa" w:w="60"/>
-              <w:left w:type="dxa" w:w="100"/>
-              <w:bottom w:type="dxa" w:w="60"/>
-              <w:right w:type="dxa" w:w="100"/>
-            </w:tcMar>
-          </w:tcPr>
-          <w:p>
-            <w:r>
-              <w:t xml:space="preserve">OPEN-204: logout sem RF</w:t>
-            </w:r>
-          </w:p>
-        </w:tc>
-        <w:tc>
-          <w:tcPr>
-            <w:tcW w:type="dxa" w:w="6526"/>
-            <w:tcMar>
-              <w:top w:type="dxa" w:w="60"/>
-              <w:left w:type="dxa" w:w="100"/>
-              <w:bottom w:type="dxa" w:w="60"/>
-              <w:right w:type="dxa" w:w="100"/>
-            </w:tcMar>
-          </w:tcPr>
-          <w:p>
-            <w:r>
-              <w:t xml:space="preserve">Vira a RF-005a: sair encerra a sessão no servidor (teste T-SESSAO-05)</w:t>
-            </w:r>
-          </w:p>
-        </w:tc>
-      </w:tr>
-      <w:tr>
-        <w:trPr>
-          <w:tblHeader w:val="false"/>
-        </w:trPr>
-        <w:tc>
-          <w:tcPr>
-            <w:tcW w:type="dxa" w:w="2500"/>
-            <w:tcMar>
-              <w:top w:type="dxa" w:w="60"/>
-              <w:left w:type="dxa" w:w="100"/>
-              <w:bottom w:type="dxa" w:w="60"/>
-              <w:right w:type="dxa" w:w="100"/>
-            </w:tcMar>
-          </w:tcPr>
-          <w:p>
-            <w:r>
-              <w:t xml:space="preserve">OPEN-205: dados do cadastro</w:t>
-            </w:r>
-          </w:p>
-        </w:tc>
-        <w:tc>
-          <w:tcPr>
-            <w:tcW w:type="dxa" w:w="6526"/>
-            <w:tcMar>
-              <w:top w:type="dxa" w:w="60"/>
-              <w:left w:type="dxa" w:w="100"/>
-              <w:bottom w:type="dxa" w:w="60"/>
-              <w:right w:type="dxa" w:w="100"/>
-            </w:tcMar>
-          </w:tcPr>
-          <w:p>
-            <w:r>
-              <w:t xml:space="preserve">Nome, e-mail, senha e perfil obrigatórios. Telefone, região e nome de exibição do prestador opcionais (RF-001)</w:t>
-            </w:r>
-          </w:p>
-        </w:tc>
-      </w:tr>
-      <w:tr>
-        <w:trPr>
-          <w:tblHeader w:val="false"/>
-        </w:trPr>
-        <w:tc>
-          <w:tcPr>
-            <w:tcW w:type="dxa" w:w="2500"/>
-            <w:tcMar>
-              <w:top w:type="dxa" w:w="60"/>
-              <w:left w:type="dxa" w:w="100"/>
-              <w:bottom w:type="dxa" w:w="60"/>
-              <w:right w:type="dxa" w:w="100"/>
-            </w:tcMar>
-          </w:tcPr>
-          <w:p>
-            <w:r>
-              <w:t xml:space="preserve">OPEN-206: conta de admin</w:t>
-            </w:r>
-          </w:p>
-        </w:tc>
-        <w:tc>
-          <w:tcPr>
-            <w:tcW w:type="dxa" w:w="6526"/>
-            <w:tcMar>
-              <w:top w:type="dxa" w:w="60"/>
-              <w:left w:type="dxa" w:w="100"/>
-              <w:bottom w:type="dxa" w:w="60"/>
-              <w:right w:type="dxa" w:w="100"/>
-            </w:tcMar>
-          </w:tcPr>
-          <w:p>
-            <w:r>
-              <w:t xml:space="preserve">O admin nasce só pelo procedimento de implantação (o seed), registrado no ADR-004 e no README. O cadastro nunca oferece ADMIN</w:t>
-            </w:r>
-          </w:p>
-        </w:tc>
-      </w:tr>
-      <w:tr>
-        <w:trPr>
-          <w:tblHeader w:val="false"/>
-        </w:trPr>
-        <w:tc>
-          <w:tcPr>
-            <w:tcW w:type="dxa" w:w="2500"/>
-            <w:tcMar>
-              <w:top w:type="dxa" w:w="60"/>
-              <w:left w:type="dxa" w:w="100"/>
-              <w:bottom w:type="dxa" w:w="60"/>
-              <w:right w:type="dxa" w:w="100"/>
-            </w:tcMar>
-          </w:tcPr>
-          <w:p>
-            <w:r>
-              <w:t xml:space="preserve">OPEN-207: reputação inicial</w:t>
-            </w:r>
-          </w:p>
-        </w:tc>
-        <w:tc>
-          <w:tcPr>
-            <w:tcW w:type="dxa" w:w="6526"/>
-            <w:tcMar>
-              <w:top w:type="dxa" w:w="60"/>
-              <w:left w:type="dxa" w:w="100"/>
-              <w:bottom w:type="dxa" w:w="60"/>
-              <w:right w:type="dxa" w:w="100"/>
-            </w:tcMar>
-          </w:tcPr>
-          <w:p>
-            <w:r>
-              <w:t xml:space="preserve">Reputação = P-08 </w:t>
-            </w:r>
-            <w:r>
-              <w:rPr>
-                <w:b/>
-                <w:bCs/>
-              </w:rPr>
-              <w:t xml:space="preserve">da criação da conta</w:t>
-            </w:r>
-            <w:r>
-              <w:t xml:space="preserve"> + eventos. Gravada em </w:t>
+            <w:tcW w:type="dxa" w:w="2300"/>
+            <w:tcMar>
+              <w:top w:type="dxa" w:w="60"/>
+              <w:left w:type="dxa" w:w="100"/>
+              <w:bottom w:type="dxa" w:w="60"/>
+              <w:right w:type="dxa" w:w="100"/>
+            </w:tcMar>
+          </w:tcPr>
+          <w:p>
+            <w:r>
+              <w:t xml:space="preserve">25 · Canal de contato</w:t>
+            </w:r>
+          </w:p>
+        </w:tc>
+        <w:tc>
+          <w:tcPr>
+            <w:tcW w:type="dxa" w:w="6726"/>
+            <w:tcMar>
+              <w:top w:type="dxa" w:w="60"/>
+              <w:left w:type="dxa" w:w="100"/>
+              <w:bottom w:type="dxa" w:w="60"/>
+              <w:right w:type="dxa" w:w="100"/>
+            </w:tcMar>
+          </w:tcPr>
+          <w:p>
+            <w:r>
+              <w:t xml:space="preserve">A conta suspensa não autentica, então o canal fica fora do sistema: um e-mail de suporte configurável (</w:t>
             </w:r>
             <w:r>
               <w:rPr>
@@ -2135,47 +1924,10 @@
                 <w:sz w:val="19"/>
                 <w:szCs w:val="19"/>
               </w:rPr>
-              <w:t xml:space="preserve">usuario.reputacao_inicial</w:t>
-            </w:r>
-            <w:r>
-              <w:t xml:space="preserve">. O código usava a P-08 atual e foi corrigido (T-CONTA-01l)</w:t>
-            </w:r>
-          </w:p>
-        </w:tc>
-      </w:tr>
-      <w:tr>
-        <w:trPr>
-          <w:tblHeader w:val="false"/>
-        </w:trPr>
-        <w:tc>
-          <w:tcPr>
-            <w:tcW w:type="dxa" w:w="2500"/>
-            <w:tcMar>
-              <w:top w:type="dxa" w:w="60"/>
-              <w:left w:type="dxa" w:w="100"/>
-              <w:bottom w:type="dxa" w:w="60"/>
-              <w:right w:type="dxa" w:w="100"/>
-            </w:tcMar>
-          </w:tcPr>
-          <w:p>
-            <w:r>
-              <w:t xml:space="preserve">OPEN-208: normalizar e-mail</w:t>
-            </w:r>
-          </w:p>
-        </w:tc>
-        <w:tc>
-          <w:tcPr>
-            <w:tcW w:type="dxa" w:w="6526"/>
-            <w:tcMar>
-              <w:top w:type="dxa" w:w="60"/>
-              <w:left w:type="dxa" w:w="100"/>
-              <w:bottom w:type="dxa" w:w="60"/>
-              <w:right w:type="dxa" w:w="100"/>
-            </w:tcMar>
-          </w:tcPr>
-          <w:p>
-            <w:r>
-              <w:t xml:space="preserve">Sem espaços nas pontas e sem diferenciar maiúsculas, normalizado só no repositório. Corrigido o bug em que um e-mail repetido com espaços estourava </w:t>
+              <w:t xml:space="preserve">CONTATO_SUPORTE</w:t>
+            </w:r>
+            <w:r>
+              <w:t xml:space="preserve">, padrão </w:t>
             </w:r>
             <w:r>
               <w:rPr>
@@ -2183,10 +1935,10 @@
                 <w:sz w:val="19"/>
                 <w:szCs w:val="19"/>
               </w:rPr>
-              <w:t xml:space="preserve">UNIQUE constraint failed</w:t>
-            </w:r>
-            <w:r>
-              <w:t xml:space="preserve"> (T-CONTA-01j)</w:t>
+              <w:t xml:space="preserve">suporte@encaixe.dev</w:t>
+            </w:r>
+            <w:r>
+              <w:t xml:space="preserve">), com link na tela. Spec v0.1.9, SPEC-002 v1.4.0</w:t>
             </w:r>
           </w:p>
         </w:tc>
@@ -2197,33 +1949,151 @@
         </w:trPr>
         <w:tc>
           <w:tcPr>
-            <w:tcW w:type="dxa" w:w="2500"/>
-            <w:tcMar>
-              <w:top w:type="dxa" w:w="60"/>
-              <w:left w:type="dxa" w:w="100"/>
-              <w:bottom w:type="dxa" w:w="60"/>
-              <w:right w:type="dxa" w:w="100"/>
-            </w:tcMar>
-          </w:tcPr>
-          <w:p>
-            <w:r>
-              <w:t xml:space="preserve">OPEN-209: enumeração de e-mail</w:t>
-            </w:r>
-          </w:p>
-        </w:tc>
-        <w:tc>
-          <w:tcPr>
-            <w:tcW w:type="dxa" w:w="6526"/>
-            <w:tcMar>
-              <w:top w:type="dxa" w:w="60"/>
-              <w:left w:type="dxa" w:w="100"/>
-              <w:bottom w:type="dxa" w:w="60"/>
-              <w:right w:type="dxa" w:w="100"/>
-            </w:tcMar>
-          </w:tcPr>
-          <w:p>
-            <w:r>
-              <w:t xml:space="preserve">Risco residual aceito, registrado em </w:t>
+            <w:tcW w:type="dxa" w:w="2300"/>
+            <w:tcMar>
+              <w:top w:type="dxa" w:w="60"/>
+              <w:left w:type="dxa" w:w="100"/>
+              <w:bottom w:type="dxa" w:w="60"/>
+              <w:right w:type="dxa" w:w="100"/>
+            </w:tcMar>
+          </w:tcPr>
+          <w:p>
+            <w:r>
+              <w:t xml:space="preserve">26 · Trilha A</w:t>
+            </w:r>
+          </w:p>
+        </w:tc>
+        <w:tc>
+          <w:tcPr>
+            <w:tcW w:type="dxa" w:w="6726"/>
+            <w:tcMar>
+              <w:top w:type="dxa" w:w="60"/>
+              <w:left w:type="dxa" w:w="100"/>
+              <w:bottom w:type="dxa" w:w="60"/>
+              <w:right w:type="dxa" w:w="100"/>
+            </w:tcMar>
+          </w:tcPr>
+          <w:p>
+            <w:r>
+              <w:t xml:space="preserve">O Gustavo implementou as oito correções da SPEC-001 e escreveu nove rascunhos de Spec (PRs #121 a #129)</w:t>
+            </w:r>
+          </w:p>
+        </w:tc>
+      </w:tr>
+      <w:tr>
+        <w:trPr>
+          <w:tblHeader w:val="false"/>
+        </w:trPr>
+        <w:tc>
+          <w:tcPr>
+            <w:tcW w:type="dxa" w:w="2300"/>
+            <w:tcMar>
+              <w:top w:type="dxa" w:w="60"/>
+              <w:left w:type="dxa" w:w="100"/>
+              <w:bottom w:type="dxa" w:w="60"/>
+              <w:right w:type="dxa" w:w="100"/>
+            </w:tcMar>
+          </w:tcPr>
+          <w:p>
+            <w:r>
+              <w:t xml:space="preserve">27 · Revisão e merge</w:t>
+            </w:r>
+          </w:p>
+        </w:tc>
+        <w:tc>
+          <w:tcPr>
+            <w:tcW w:type="dxa" w:w="6726"/>
+            <w:tcMar>
+              <w:top w:type="dxa" w:w="60"/>
+              <w:left w:type="dxa" w:w="100"/>
+              <w:bottom w:type="dxa" w:w="60"/>
+              <w:right w:type="dxa" w:w="100"/>
+            </w:tcMar>
+          </w:tcPr>
+          <w:p>
+            <w:r>
+              <w:t xml:space="preserve">Os nove PRs entraram. No #123 (comissão), a auditoria passou a registrar quem causou cada mudança: ator nulo é o sistema (§9.2), e a retenção e o estorno vinham como se fossem do sistema. Os rascunhos entraram marcados como </w:t>
+            </w:r>
+            <w:r>
+              <w:rPr>
+                <w:b/>
+                <w:bCs/>
+              </w:rPr>
+              <w:t xml:space="preserve">não aprovados</w:t>
+            </w:r>
+          </w:p>
+        </w:tc>
+      </w:tr>
+      <w:tr>
+        <w:trPr>
+          <w:tblHeader w:val="false"/>
+        </w:trPr>
+        <w:tc>
+          <w:tcPr>
+            <w:tcW w:type="dxa" w:w="2300"/>
+            <w:tcMar>
+              <w:top w:type="dxa" w:w="60"/>
+              <w:left w:type="dxa" w:w="100"/>
+              <w:bottom w:type="dxa" w:w="60"/>
+              <w:right w:type="dxa" w:w="100"/>
+            </w:tcMar>
+          </w:tcPr>
+          <w:p>
+            <w:r>
+              <w:t xml:space="preserve">27 · Ajustes visuais</w:t>
+            </w:r>
+          </w:p>
+        </w:tc>
+        <w:tc>
+          <w:tcPr>
+            <w:tcW w:type="dxa" w:w="6726"/>
+            <w:tcMar>
+              <w:top w:type="dxa" w:w="60"/>
+              <w:left w:type="dxa" w:w="100"/>
+              <w:bottom w:type="dxa" w:w="60"/>
+              <w:right w:type="dxa" w:w="100"/>
+            </w:tcMar>
+          </w:tcPr>
+          <w:p>
+            <w:r>
+              <w:t xml:space="preserve">Aba ativa única na navegação; régua sem o rótulo invadir a barra; traço dos cartões dentro do contorno; filtros da busca alinhados; cartões da P-22 legíveis; preço cheio à direita; cartões da mesma linha da grade na mesma altura (PRs #130 a #133)</w:t>
+            </w:r>
+          </w:p>
+        </w:tc>
+      </w:tr>
+      <w:tr>
+        <w:trPr>
+          <w:tblHeader w:val="false"/>
+        </w:trPr>
+        <w:tc>
+          <w:tcPr>
+            <w:tcW w:type="dxa" w:w="2300"/>
+            <w:tcMar>
+              <w:top w:type="dxa" w:w="60"/>
+              <w:left w:type="dxa" w:w="100"/>
+              <w:bottom w:type="dxa" w:w="60"/>
+              <w:right w:type="dxa" w:w="100"/>
+            </w:tcMar>
+          </w:tcPr>
+          <w:p>
+            <w:r>
+              <w:t xml:space="preserve">28 · SPEC-001 concluída</w:t>
+            </w:r>
+          </w:p>
+        </w:tc>
+        <w:tc>
+          <w:tcPr>
+            <w:tcW w:type="dxa" w:w="6726"/>
+            <w:tcMar>
+              <w:top w:type="dxa" w:w="60"/>
+              <w:left w:type="dxa" w:w="100"/>
+              <w:bottom w:type="dxa" w:w="60"/>
+              <w:right w:type="dxa" w:w="100"/>
+            </w:tcMar>
+          </w:tcPr>
+          <w:p>
+            <w:r>
+              <w:t xml:space="preserve">Entraram o </w:t>
             </w:r>
             <w:r>
               <w:rPr>
@@ -2231,47 +2101,10 @@
                 <w:sz w:val="19"/>
                 <w:szCs w:val="19"/>
               </w:rPr>
-              <w:t xml:space="preserve">seguranca.md</w:t>
-            </w:r>
-            <w:r>
-              <w:t xml:space="preserve"> A2. Esconder exigiria confirmação por e-mail, que o MVP não tem</w:t>
-            </w:r>
-          </w:p>
-        </w:tc>
-      </w:tr>
-      <w:tr>
-        <w:trPr>
-          <w:tblHeader w:val="false"/>
-        </w:trPr>
-        <w:tc>
-          <w:tcPr>
-            <w:tcW w:type="dxa" w:w="2500"/>
-            <w:tcMar>
-              <w:top w:type="dxa" w:w="60"/>
-              <w:left w:type="dxa" w:w="100"/>
-              <w:bottom w:type="dxa" w:w="60"/>
-              <w:right w:type="dxa" w:w="100"/>
-            </w:tcMar>
-          </w:tcPr>
-          <w:p>
-            <w:r>
-              <w:t xml:space="preserve">INV-004 no banco</w:t>
-            </w:r>
-          </w:p>
-        </w:tc>
-        <w:tc>
-          <w:tcPr>
-            <w:tcW w:type="dxa" w:w="6526"/>
-            <w:tcMar>
-              <w:top w:type="dxa" w:w="60"/>
-              <w:left w:type="dxa" w:w="100"/>
-              <w:bottom w:type="dxa" w:w="60"/>
-              <w:right w:type="dxa" w:w="100"/>
-            </w:tcMar>
-          </w:tcPr>
-          <w:p>
-            <w:r>
-              <w:t xml:space="preserve">Gatilho </w:t>
+              <w:t xml:space="preserve">T-DOMINIO-01</w:t>
+            </w:r>
+            <w:r>
+              <w:t xml:space="preserve"> (o domínio não importa I/O nem lê o relógio) e o </w:t>
             </w:r>
             <w:r>
               <w:rPr>
@@ -2279,21 +2112,10 @@
                 <w:sz w:val="19"/>
                 <w:szCs w:val="19"/>
               </w:rPr>
-              <w:t xml:space="preserve">BEFORE INSERT</w:t>
-            </w:r>
-            <w:r>
-              <w:t xml:space="preserve"> </w:t>
-            </w:r>
-            <w:r>
-              <w:rPr>
-                <w:rFonts w:ascii="Consolas" w:cs="Consolas" w:eastAsia="Consolas" w:hAnsi="Consolas"/>
-                <w:sz w:val="19"/>
-                <w:szCs w:val="19"/>
-              </w:rPr>
-              <w:t xml:space="preserve">usuario_nasce_no_estado_inicial</w:t>
-            </w:r>
-            <w:r>
-              <w:t xml:space="preserve">. Só olha a criação, então as mudanças de estado seguintes continuam livres (T-CONTA-01k)</w:t>
+              <w:t xml:space="preserve">T-ESTADO-03b</w:t>
+            </w:r>
+            <w:r>
+              <w:t xml:space="preserve"> (o banco recusa estado inexistente). Issues #80 e #9 fechadas (PR #134)</w:t>
             </w:r>
           </w:p>
         </w:tc>
@@ -2302,6 +2124,7 @@
     <w:p>
       <w:pPr>
         <w:pStyle w:val="Heading1"/>
+        <w:spacing w:before="280" w:after="120"/>
       </w:pPr>
       <w:r>
         <w:t xml:space="preserve">6. Pontos de atenção</w:t>
@@ -2312,7 +2135,7 @@
         <w:pStyle w:val="ListParagraph"/>
         <w:numPr>
           <w:ilvl w:val="0"/>
-          <w:numId w:val="4"/>
+          <w:numId w:val="3"/>
         </w:numPr>
         <w:spacing w:after="60"/>
       </w:pPr>
@@ -2321,10 +2144,21 @@
           <w:b/>
           <w:bCs/>
         </w:rPr>
-        <w:t xml:space="preserve">T-68 (#70):</w:t>
-      </w:r>
-      <w:r>
-        <w:t xml:space="preserve"> a RN-05 continua com teste parcial. "Tudo verde" não significa "toda regra coberta".</w:t>
+        <w:t xml:space="preserve">Merge de rascunho não é aprovação.</w:t>
+      </w:r>
+      <w:r>
+        <w:t xml:space="preserve"> As SPEC-006 a 026 que estão na </w:t>
+      </w:r>
+      <w:r>
+        <w:rPr>
+          <w:rFonts w:ascii="Consolas" w:cs="Consolas" w:eastAsia="Consolas" w:hAnsi="Consolas"/>
+          <w:sz w:val="19"/>
+          <w:szCs w:val="19"/>
+        </w:rPr>
+        <w:t xml:space="preserve">main</w:t>
+      </w:r>
+      <w:r>
+        <w:t xml:space="preserve"> ainda dependem da equipe.</w:t>
       </w:r>
     </w:p>
     <w:p>
@@ -2332,7 +2166,7 @@
         <w:pStyle w:val="ListParagraph"/>
         <w:numPr>
           <w:ilvl w:val="0"/>
-          <w:numId w:val="4"/>
+          <w:numId w:val="3"/>
         </w:numPr>
         <w:spacing w:after="60"/>
       </w:pPr>
@@ -2341,10 +2175,32 @@
           <w:b/>
           <w:bCs/>
         </w:rPr>
-        <w:t xml:space="preserve">[CANAL DE CONTATO]:</w:t>
-      </w:r>
-      <w:r>
-        <w:t xml:space="preserve"> a tela de conta suspensa ainda tem esse texto provisório, até a equipe definir o canal.</w:t>
+        <w:t xml:space="preserve">Comissão:</w:t>
+      </w:r>
+      <w:r>
+        <w:t xml:space="preserve"> toda mudança de estado do lançamento passa por </w:t>
+      </w:r>
+      <w:r>
+        <w:rPr>
+          <w:rFonts w:ascii="Consolas" w:cs="Consolas" w:eastAsia="Consolas" w:hAnsi="Consolas"/>
+          <w:sz w:val="19"/>
+          <w:szCs w:val="19"/>
+        </w:rPr>
+        <w:t xml:space="preserve">transicionar()</w:t>
+      </w:r>
+      <w:r>
+        <w:t xml:space="preserve"> em </w:t>
+      </w:r>
+      <w:r>
+        <w:rPr>
+          <w:rFonts w:ascii="Consolas" w:cs="Consolas" w:eastAsia="Consolas" w:hAnsi="Consolas"/>
+          <w:sz w:val="19"/>
+          <w:szCs w:val="19"/>
+        </w:rPr>
+        <w:t xml:space="preserve">aplicacao/comissao.js</w:t>
+      </w:r>
+      <w:r>
+        <w:t xml:space="preserve">, que exige o ator. Não grave o estado direto pelo repositório.</w:t>
       </w:r>
     </w:p>
     <w:p>
@@ -2352,7 +2208,20 @@
         <w:pStyle w:val="ListParagraph"/>
         <w:numPr>
           <w:ilvl w:val="0"/>
-          <w:numId w:val="4"/>
+          <w:numId w:val="3"/>
+        </w:numPr>
+        <w:spacing w:after="60"/>
+      </w:pPr>
+      <w:r>
+        <w:t xml:space="preserve">T-68 (#70): a RN-05 continua com teste parcial. "Tudo verde" não significa "toda regra coberta".</w:t>
+      </w:r>
+    </w:p>
+    <w:p>
+      <w:pPr>
+        <w:pStyle w:val="ListParagraph"/>
+        <w:numPr>
+          <w:ilvl w:val="0"/>
+          <w:numId w:val="3"/>
         </w:numPr>
         <w:spacing w:after="60"/>
       </w:pPr>
@@ -2376,7 +2245,7 @@
         <w:pStyle w:val="ListParagraph"/>
         <w:numPr>
           <w:ilvl w:val="0"/>
-          <w:numId w:val="4"/>
+          <w:numId w:val="3"/>
         </w:numPr>
         <w:spacing w:after="60"/>
       </w:pPr>
@@ -2397,7 +2266,7 @@
         <w:pStyle w:val="ListParagraph"/>
         <w:numPr>
           <w:ilvl w:val="0"/>
-          <w:numId w:val="4"/>
+          <w:numId w:val="3"/>
         </w:numPr>
         <w:spacing w:after="60"/>
       </w:pPr>
@@ -2410,7 +2279,7 @@
         <w:pStyle w:val="ListParagraph"/>
         <w:numPr>
           <w:ilvl w:val="0"/>
-          <w:numId w:val="4"/>
+          <w:numId w:val="3"/>
         </w:numPr>
         <w:spacing w:after="60"/>
       </w:pPr>
@@ -2432,6 +2301,7 @@
     <w:p>
       <w:pPr>
         <w:pStyle w:val="Heading1"/>
+        <w:spacing w:before="280" w:after="120"/>
       </w:pPr>
       <w:r>
         <w:t xml:space="preserve">7. Onde encontrar cada coisa</w:t>
@@ -2450,8 +2320,8 @@
         </w:tblBorders>
       </w:tblPr>
       <w:tblGrid>
-        <w:gridCol w:w="3600"/>
-        <w:gridCol w:w="5426"/>
+        <w:gridCol w:w="3300"/>
+        <w:gridCol w:w="5726"/>
       </w:tblGrid>
       <w:tr>
         <w:trPr>
@@ -2459,7 +2329,7 @@
         </w:trPr>
         <w:tc>
           <w:tcPr>
-            <w:tcW w:type="dxa" w:w="3600"/>
+            <w:tcW w:type="dxa" w:w="3300"/>
             <w:shd w:fill="EAEBFB" w:color="auto" w:val="clear"/>
             <w:tcMar>
               <w:top w:type="dxa" w:w="60"/>
@@ -2480,7 +2350,7 @@
         </w:tc>
         <w:tc>
           <w:tcPr>
-            <w:tcW w:type="dxa" w:w="5426"/>
+            <w:tcW w:type="dxa" w:w="5726"/>
             <w:shd w:fill="EAEBFB" w:color="auto" w:val="clear"/>
             <w:tcMar>
               <w:top w:type="dxa" w:w="60"/>
@@ -2506,28 +2376,23 @@
         </w:trPr>
         <w:tc>
           <w:tcPr>
-            <w:tcW w:type="dxa" w:w="3600"/>
-            <w:tcMar>
-              <w:top w:type="dxa" w:w="60"/>
-              <w:left w:type="dxa" w:w="100"/>
-              <w:bottom w:type="dxa" w:w="60"/>
-              <w:right w:type="dxa" w:w="100"/>
-            </w:tcMar>
-          </w:tcPr>
-          <w:p>
-            <w:r>
-              <w:rPr>
-                <w:rFonts w:ascii="Consolas" w:cs="Consolas" w:eastAsia="Consolas" w:hAnsi="Consolas"/>
-                <w:sz w:val="19"/>
-                <w:szCs w:val="19"/>
-              </w:rPr>
+            <w:tcW w:type="dxa" w:w="3300"/>
+            <w:tcMar>
+              <w:top w:type="dxa" w:w="60"/>
+              <w:left w:type="dxa" w:w="100"/>
+              <w:bottom w:type="dxa" w:w="60"/>
+              <w:right w:type="dxa" w:w="100"/>
+            </w:tcMar>
+          </w:tcPr>
+          <w:p>
+            <w:r>
               <w:t xml:space="preserve">README.md</w:t>
             </w:r>
           </w:p>
         </w:tc>
         <w:tc>
           <w:tcPr>
-            <w:tcW w:type="dxa" w:w="5426"/>
+            <w:tcW w:type="dxa" w:w="5726"/>
             <w:tcMar>
               <w:top w:type="dxa" w:w="60"/>
               <w:left w:type="dxa" w:w="100"/>
@@ -2581,38 +2446,33 @@
         </w:trPr>
         <w:tc>
           <w:tcPr>
-            <w:tcW w:type="dxa" w:w="3600"/>
-            <w:tcMar>
-              <w:top w:type="dxa" w:w="60"/>
-              <w:left w:type="dxa" w:w="100"/>
-              <w:bottom w:type="dxa" w:w="60"/>
-              <w:right w:type="dxa" w:w="100"/>
-            </w:tcMar>
-          </w:tcPr>
-          <w:p>
-            <w:r>
-              <w:rPr>
-                <w:rFonts w:ascii="Consolas" w:cs="Consolas" w:eastAsia="Consolas" w:hAnsi="Consolas"/>
-                <w:sz w:val="19"/>
-                <w:szCs w:val="19"/>
-              </w:rPr>
+            <w:tcW w:type="dxa" w:w="3300"/>
+            <w:tcMar>
+              <w:top w:type="dxa" w:w="60"/>
+              <w:left w:type="dxa" w:w="100"/>
+              <w:bottom w:type="dxa" w:w="60"/>
+              <w:right w:type="dxa" w:w="100"/>
+            </w:tcMar>
+          </w:tcPr>
+          <w:p>
+            <w:r>
               <w:t xml:space="preserve">docs/spec.md</w:t>
             </w:r>
           </w:p>
         </w:tc>
         <w:tc>
           <w:tcPr>
-            <w:tcW w:type="dxa" w:w="5426"/>
-            <w:tcMar>
-              <w:top w:type="dxa" w:w="60"/>
-              <w:left w:type="dxa" w:w="100"/>
-              <w:bottom w:type="dxa" w:w="60"/>
-              <w:right w:type="dxa" w:w="100"/>
-            </w:tcMar>
-          </w:tcPr>
-          <w:p>
-            <w:r>
-              <w:t xml:space="preserve">fonte de verdade (v0.1.8): regras, requisitos, estados e invariantes</w:t>
+            <w:tcW w:type="dxa" w:w="5726"/>
+            <w:tcMar>
+              <w:top w:type="dxa" w:w="60"/>
+              <w:left w:type="dxa" w:w="100"/>
+              <w:bottom w:type="dxa" w:w="60"/>
+              <w:right w:type="dxa" w:w="100"/>
+            </w:tcMar>
+          </w:tcPr>
+          <w:p>
+            <w:r>
+              <w:t xml:space="preserve">fonte de verdade (v0.1.9): regras, requisitos, estados e invariantes</w:t>
             </w:r>
           </w:p>
         </w:tc>
@@ -2623,28 +2483,23 @@
         </w:trPr>
         <w:tc>
           <w:tcPr>
-            <w:tcW w:type="dxa" w:w="3600"/>
-            <w:tcMar>
-              <w:top w:type="dxa" w:w="60"/>
-              <w:left w:type="dxa" w:w="100"/>
-              <w:bottom w:type="dxa" w:w="60"/>
-              <w:right w:type="dxa" w:w="100"/>
-            </w:tcMar>
-          </w:tcPr>
-          <w:p>
-            <w:r>
-              <w:rPr>
-                <w:rFonts w:ascii="Consolas" w:cs="Consolas" w:eastAsia="Consolas" w:hAnsi="Consolas"/>
-                <w:sz w:val="19"/>
-                <w:szCs w:val="19"/>
-              </w:rPr>
+            <w:tcW w:type="dxa" w:w="3300"/>
+            <w:tcMar>
+              <w:top w:type="dxa" w:w="60"/>
+              <w:left w:type="dxa" w:w="100"/>
+              <w:bottom w:type="dxa" w:w="60"/>
+              <w:right w:type="dxa" w:w="100"/>
+            </w:tcMar>
+          </w:tcPr>
+          <w:p>
+            <w:r>
               <w:t xml:space="preserve">docs/specs/mapa-de-specs.md</w:t>
             </w:r>
           </w:p>
         </w:tc>
         <w:tc>
           <w:tcPr>
-            <w:tcW w:type="dxa" w:w="5426"/>
+            <w:tcW w:type="dxa" w:w="5726"/>
             <w:tcMar>
               <w:top w:type="dxa" w:w="60"/>
               <w:left w:type="dxa" w:w="100"/>
@@ -2665,38 +2520,33 @@
         </w:trPr>
         <w:tc>
           <w:tcPr>
-            <w:tcW w:type="dxa" w:w="3600"/>
-            <w:tcMar>
-              <w:top w:type="dxa" w:w="60"/>
-              <w:left w:type="dxa" w:w="100"/>
-              <w:bottom w:type="dxa" w:w="60"/>
-              <w:right w:type="dxa" w:w="100"/>
-            </w:tcMar>
-          </w:tcPr>
-          <w:p>
-            <w:r>
-              <w:rPr>
-                <w:rFonts w:ascii="Consolas" w:cs="Consolas" w:eastAsia="Consolas" w:hAnsi="Consolas"/>
-                <w:sz w:val="19"/>
-                <w:szCs w:val="19"/>
-              </w:rPr>
+            <w:tcW w:type="dxa" w:w="3300"/>
+            <w:tcMar>
+              <w:top w:type="dxa" w:w="60"/>
+              <w:left w:type="dxa" w:w="100"/>
+              <w:bottom w:type="dxa" w:w="60"/>
+              <w:right w:type="dxa" w:w="100"/>
+            </w:tcMar>
+          </w:tcPr>
+          <w:p>
+            <w:r>
               <w:t xml:space="preserve">docs/specs/SPEC-0XX-*.md</w:t>
             </w:r>
           </w:p>
         </w:tc>
         <w:tc>
           <w:tcPr>
-            <w:tcW w:type="dxa" w:w="5426"/>
-            <w:tcMar>
-              <w:top w:type="dxa" w:w="60"/>
-              <w:left w:type="dxa" w:w="100"/>
-              <w:bottom w:type="dxa" w:w="60"/>
-              <w:right w:type="dxa" w:w="100"/>
-            </w:tcMar>
-          </w:tcPr>
-          <w:p>
-            <w:r>
-              <w:t xml:space="preserve">as Specs aprovadas (001 a 005)</w:t>
+            <w:tcW w:type="dxa" w:w="5726"/>
+            <w:tcMar>
+              <w:top w:type="dxa" w:w="60"/>
+              <w:left w:type="dxa" w:w="100"/>
+              <w:bottom w:type="dxa" w:w="60"/>
+              <w:right w:type="dxa" w:w="100"/>
+            </w:tcMar>
+          </w:tcPr>
+          <w:p>
+            <w:r>
+              <w:t xml:space="preserve">aprovadas: 001 a 005 (001 e 002 concluídas); rascunhos: 006 a 009, 011, 020, 021, 024 e 026</w:t>
             </w:r>
           </w:p>
         </w:tc>
@@ -2707,38 +2557,33 @@
         </w:trPr>
         <w:tc>
           <w:tcPr>
-            <w:tcW w:type="dxa" w:w="3600"/>
-            <w:tcMar>
-              <w:top w:type="dxa" w:w="60"/>
-              <w:left w:type="dxa" w:w="100"/>
-              <w:bottom w:type="dxa" w:w="60"/>
-              <w:right w:type="dxa" w:w="100"/>
-            </w:tcMar>
-          </w:tcPr>
-          <w:p>
-            <w:r>
-              <w:rPr>
-                <w:rFonts w:ascii="Consolas" w:cs="Consolas" w:eastAsia="Consolas" w:hAnsi="Consolas"/>
-                <w:sz w:val="19"/>
-                <w:szCs w:val="19"/>
-              </w:rPr>
+            <w:tcW w:type="dxa" w:w="3300"/>
+            <w:tcMar>
+              <w:top w:type="dxa" w:w="60"/>
+              <w:left w:type="dxa" w:w="100"/>
+              <w:bottom w:type="dxa" w:w="60"/>
+              <w:right w:type="dxa" w:w="100"/>
+            </w:tcMar>
+          </w:tcPr>
+          <w:p>
+            <w:r>
               <w:t xml:space="preserve">docs/specs/registro-sdd.md</w:t>
             </w:r>
           </w:p>
         </w:tc>
         <w:tc>
           <w:tcPr>
-            <w:tcW w:type="dxa" w:w="5426"/>
-            <w:tcMar>
-              <w:top w:type="dxa" w:w="60"/>
-              <w:left w:type="dxa" w:w="100"/>
-              <w:bottom w:type="dxa" w:w="60"/>
-              <w:right w:type="dxa" w:w="100"/>
-            </w:tcMar>
-          </w:tcPr>
-          <w:p>
-            <w:r>
-              <w:t xml:space="preserve">diário de cada etapa: o que foi pedido, decidido e feito (etapas 1 a 24)</w:t>
+            <w:tcW w:type="dxa" w:w="5726"/>
+            <w:tcMar>
+              <w:top w:type="dxa" w:w="60"/>
+              <w:left w:type="dxa" w:w="100"/>
+              <w:bottom w:type="dxa" w:w="60"/>
+              <w:right w:type="dxa" w:w="100"/>
+            </w:tcMar>
+          </w:tcPr>
+          <w:p>
+            <w:r>
+              <w:t xml:space="preserve">diário de cada etapa: o que foi pedido, decidido e feito (etapas 1 a 28)</w:t>
             </w:r>
           </w:p>
         </w:tc>
@@ -2749,38 +2594,33 @@
         </w:trPr>
         <w:tc>
           <w:tcPr>
-            <w:tcW w:type="dxa" w:w="3600"/>
-            <w:tcMar>
-              <w:top w:type="dxa" w:w="60"/>
-              <w:left w:type="dxa" w:w="100"/>
-              <w:bottom w:type="dxa" w:w="60"/>
-              <w:right w:type="dxa" w:w="100"/>
-            </w:tcMar>
-          </w:tcPr>
-          <w:p>
-            <w:r>
-              <w:rPr>
-                <w:rFonts w:ascii="Consolas" w:cs="Consolas" w:eastAsia="Consolas" w:hAnsi="Consolas"/>
-                <w:sz w:val="19"/>
-                <w:szCs w:val="19"/>
-              </w:rPr>
+            <w:tcW w:type="dxa" w:w="3300"/>
+            <w:tcMar>
+              <w:top w:type="dxa" w:w="60"/>
+              <w:left w:type="dxa" w:w="100"/>
+              <w:bottom w:type="dxa" w:w="60"/>
+              <w:right w:type="dxa" w:w="100"/>
+            </w:tcMar>
+          </w:tcPr>
+          <w:p>
+            <w:r>
               <w:t xml:space="preserve">docs/specs/propostas-decisoes-trilha-a.md</w:t>
             </w:r>
           </w:p>
         </w:tc>
         <w:tc>
           <w:tcPr>
-            <w:tcW w:type="dxa" w:w="5426"/>
-            <w:tcMar>
-              <w:top w:type="dxa" w:w="60"/>
-              <w:left w:type="dxa" w:w="100"/>
-              <w:bottom w:type="dxa" w:w="60"/>
-              <w:right w:type="dxa" w:w="100"/>
-            </w:tcMar>
-          </w:tcPr>
-          <w:p>
-            <w:r>
-              <w:t xml:space="preserve">as decisões A a E e as oito correções do código</w:t>
+            <w:tcW w:type="dxa" w:w="5726"/>
+            <w:tcMar>
+              <w:top w:type="dxa" w:w="60"/>
+              <w:left w:type="dxa" w:w="100"/>
+              <w:bottom w:type="dxa" w:w="60"/>
+              <w:right w:type="dxa" w:w="100"/>
+            </w:tcMar>
+          </w:tcPr>
+          <w:p>
+            <w:r>
+              <w:t xml:space="preserve">as decisões A a E e as oito correções da SPEC-001 (todas feitas)</w:t>
             </w:r>
           </w:p>
         </w:tc>
@@ -2791,28 +2631,23 @@
         </w:trPr>
         <w:tc>
           <w:tcPr>
-            <w:tcW w:type="dxa" w:w="3600"/>
-            <w:tcMar>
-              <w:top w:type="dxa" w:w="60"/>
-              <w:left w:type="dxa" w:w="100"/>
-              <w:bottom w:type="dxa" w:w="60"/>
-              <w:right w:type="dxa" w:w="100"/>
-            </w:tcMar>
-          </w:tcPr>
-          <w:p>
-            <w:r>
-              <w:rPr>
-                <w:rFonts w:ascii="Consolas" w:cs="Consolas" w:eastAsia="Consolas" w:hAnsi="Consolas"/>
-                <w:sz w:val="19"/>
-                <w:szCs w:val="19"/>
-              </w:rPr>
+            <w:tcW w:type="dxa" w:w="3300"/>
+            <w:tcMar>
+              <w:top w:type="dxa" w:w="60"/>
+              <w:left w:type="dxa" w:w="100"/>
+              <w:bottom w:type="dxa" w:w="60"/>
+              <w:right w:type="dxa" w:w="100"/>
+            </w:tcMar>
+          </w:tcPr>
+          <w:p>
+            <w:r>
               <w:t xml:space="preserve">docs/specs/layouts/SPEC-002/</w:t>
             </w:r>
           </w:p>
         </w:tc>
         <w:tc>
           <w:tcPr>
-            <w:tcW w:type="dxa" w:w="5426"/>
+            <w:tcW w:type="dxa" w:w="5726"/>
             <w:tcMar>
               <w:top w:type="dxa" w:w="60"/>
               <w:left w:type="dxa" w:w="100"/>
@@ -2833,28 +2668,23 @@
         </w:trPr>
         <w:tc>
           <w:tcPr>
-            <w:tcW w:type="dxa" w:w="3600"/>
-            <w:tcMar>
-              <w:top w:type="dxa" w:w="60"/>
-              <w:left w:type="dxa" w:w="100"/>
-              <w:bottom w:type="dxa" w:w="60"/>
-              <w:right w:type="dxa" w:w="100"/>
-            </w:tcMar>
-          </w:tcPr>
-          <w:p>
-            <w:r>
-              <w:rPr>
-                <w:rFonts w:ascii="Consolas" w:cs="Consolas" w:eastAsia="Consolas" w:hAnsi="Consolas"/>
-                <w:sz w:val="19"/>
-                <w:szCs w:val="19"/>
-              </w:rPr>
+            <w:tcW w:type="dxa" w:w="3300"/>
+            <w:tcMar>
+              <w:top w:type="dxa" w:w="60"/>
+              <w:left w:type="dxa" w:w="100"/>
+              <w:bottom w:type="dxa" w:w="60"/>
+              <w:right w:type="dxa" w:w="100"/>
+            </w:tcMar>
+          </w:tcPr>
+          <w:p>
+            <w:r>
               <w:t xml:space="preserve">docs/adr/</w:t>
             </w:r>
           </w:p>
         </w:tc>
         <w:tc>
           <w:tcPr>
-            <w:tcW w:type="dxa" w:w="5426"/>
+            <w:tcW w:type="dxa" w:w="5726"/>
             <w:tcMar>
               <w:top w:type="dxa" w:w="60"/>
               <w:left w:type="dxa" w:w="100"/>
@@ -2875,28 +2705,23 @@
         </w:trPr>
         <w:tc>
           <w:tcPr>
-            <w:tcW w:type="dxa" w:w="3600"/>
-            <w:tcMar>
-              <w:top w:type="dxa" w:w="60"/>
-              <w:left w:type="dxa" w:w="100"/>
-              <w:bottom w:type="dxa" w:w="60"/>
-              <w:right w:type="dxa" w:w="100"/>
-            </w:tcMar>
-          </w:tcPr>
-          <w:p>
-            <w:r>
-              <w:rPr>
-                <w:rFonts w:ascii="Consolas" w:cs="Consolas" w:eastAsia="Consolas" w:hAnsi="Consolas"/>
-                <w:sz w:val="19"/>
-                <w:szCs w:val="19"/>
-              </w:rPr>
+            <w:tcW w:type="dxa" w:w="3300"/>
+            <w:tcMar>
+              <w:top w:type="dxa" w:w="60"/>
+              <w:left w:type="dxa" w:w="100"/>
+              <w:bottom w:type="dxa" w:w="60"/>
+              <w:right w:type="dxa" w:w="100"/>
+            </w:tcMar>
+          </w:tcPr>
+          <w:p>
+            <w:r>
               <w:t xml:space="preserve">docs/tasks.md</w:t>
             </w:r>
           </w:p>
         </w:tc>
         <w:tc>
           <w:tcPr>
-            <w:tcW w:type="dxa" w:w="5426"/>
+            <w:tcW w:type="dxa" w:w="5726"/>
             <w:tcMar>
               <w:top w:type="dxa" w:w="60"/>
               <w:left w:type="dxa" w:w="100"/>
@@ -2917,28 +2742,23 @@
         </w:trPr>
         <w:tc>
           <w:tcPr>
-            <w:tcW w:type="dxa" w:w="3600"/>
-            <w:tcMar>
-              <w:top w:type="dxa" w:w="60"/>
-              <w:left w:type="dxa" w:w="100"/>
-              <w:bottom w:type="dxa" w:w="60"/>
-              <w:right w:type="dxa" w:w="100"/>
-            </w:tcMar>
-          </w:tcPr>
-          <w:p>
-            <w:r>
-              <w:rPr>
-                <w:rFonts w:ascii="Consolas" w:cs="Consolas" w:eastAsia="Consolas" w:hAnsi="Consolas"/>
-                <w:sz w:val="19"/>
-                <w:szCs w:val="19"/>
-              </w:rPr>
+            <w:tcW w:type="dxa" w:w="3300"/>
+            <w:tcMar>
+              <w:top w:type="dxa" w:w="60"/>
+              <w:left w:type="dxa" w:w="100"/>
+              <w:bottom w:type="dxa" w:w="60"/>
+              <w:right w:type="dxa" w:w="100"/>
+            </w:tcMar>
+          </w:tcPr>
+          <w:p>
+            <w:r>
               <w:t xml:space="preserve">.specify/memory/constitution.md</w:t>
             </w:r>
           </w:p>
         </w:tc>
         <w:tc>
           <w:tcPr>
-            <w:tcW w:type="dxa" w:w="5426"/>
+            <w:tcW w:type="dxa" w:w="5726"/>
             <w:tcMar>
               <w:top w:type="dxa" w:w="60"/>
               <w:left w:type="dxa" w:w="100"/>
@@ -2956,7 +2776,12 @@
     </w:tbl>
     <w:p>
       <w:pPr>
-        <w:spacing w:before="160" w:after="60"/>
+        <w:spacing w:after="60"/>
+      </w:pPr>
+    </w:p>
+    <w:p>
+      <w:pPr>
+        <w:spacing w:after="120"/>
       </w:pPr>
       <w:r>
         <w:t xml:space="preserve">Links publicados (privados: quem criou precisa compartilhar antes de os outros abrirem):</w:t>
@@ -2967,10 +2792,10 @@
         <w:pStyle w:val="ListParagraph"/>
         <w:numPr>
           <w:ilvl w:val="0"/>
-          <w:numId w:val="4"/>
+          <w:numId w:val="3"/>
         </w:numPr>
       </w:pPr>
-      <w:hyperlink w:history="1" r:id="rIdtttgrbmbrhdzxko9ka1m_">
+      <w:hyperlink w:history="1" r:id="rIdev19zl5tubrnxupt7wwk_">
         <w:r>
           <w:rPr>
             <w:rStyle w:val="Hyperlink"/>
@@ -2984,10 +2809,10 @@
         <w:pStyle w:val="ListParagraph"/>
         <w:numPr>
           <w:ilvl w:val="0"/>
-          <w:numId w:val="4"/>
+          <w:numId w:val="3"/>
         </w:numPr>
       </w:pPr>
-      <w:hyperlink w:history="1" r:id="rIdragt29ylkqfnclyld9co4">
+      <w:hyperlink w:history="1" r:id="rIdowp-fq0mc8yxhyxsqam9y">
         <w:r>
           <w:rPr>
             <w:rStyle w:val="Hyperlink"/>
@@ -2999,6 +2824,7 @@
     <w:p>
       <w:pPr>
         <w:pStyle w:val="Heading1"/>
+        <w:spacing w:before="280" w:after="120"/>
       </w:pPr>
       <w:r>
         <w:t xml:space="preserve">8. Ordem de leitura para quem chega agora</w:t>
@@ -3009,7 +2835,7 @@
         <w:pStyle w:val="ListParagraph"/>
         <w:numPr>
           <w:ilvl w:val="0"/>
-          <w:numId w:val="5"/>
+          <w:numId w:val="4"/>
         </w:numPr>
         <w:spacing w:after="60"/>
       </w:pPr>
@@ -3022,20 +2848,12 @@
         <w:pStyle w:val="ListParagraph"/>
         <w:numPr>
           <w:ilvl w:val="0"/>
-          <w:numId w:val="5"/>
+          <w:numId w:val="4"/>
         </w:numPr>
         <w:spacing w:after="60"/>
       </w:pPr>
       <w:r>
-        <w:rPr>
-          <w:rFonts w:ascii="Consolas" w:cs="Consolas" w:eastAsia="Consolas" w:hAnsi="Consolas"/>
-          <w:sz w:val="19"/>
-          <w:szCs w:val="19"/>
-        </w:rPr>
-        <w:t xml:space="preserve">README.md</w:t>
-      </w:r>
-      <w:r>
-        <w:t xml:space="preserve">, e rodar o projeto uma vez com as contas de demonstração.</w:t>
+        <w:t xml:space="preserve">README.md, e rodar o projeto uma vez com as contas de demonstração.</w:t>
       </w:r>
     </w:p>
     <w:p>
@@ -3043,7 +2861,7 @@
         <w:pStyle w:val="ListParagraph"/>
         <w:numPr>
           <w:ilvl w:val="0"/>
-          <w:numId w:val="5"/>
+          <w:numId w:val="4"/>
         </w:numPr>
         <w:spacing w:after="60"/>
       </w:pPr>
@@ -3056,7 +2874,7 @@
         <w:pStyle w:val="ListParagraph"/>
         <w:numPr>
           <w:ilvl w:val="0"/>
-          <w:numId w:val="5"/>
+          <w:numId w:val="4"/>
         </w:numPr>
         <w:spacing w:after="60"/>
       </w:pPr>
@@ -3077,12 +2895,12 @@
         <w:pStyle w:val="ListParagraph"/>
         <w:numPr>
           <w:ilvl w:val="0"/>
-          <w:numId w:val="5"/>
+          <w:numId w:val="4"/>
         </w:numPr>
         <w:spacing w:after="60"/>
       </w:pPr>
       <w:r>
-        <w:t xml:space="preserve">O mapa de Specs e as SPEC-001 e SPEC-002, como exemplo do formato.</w:t>
+        <w:t xml:space="preserve">O mapa de Specs e a SPEC-001, como exemplo de Spec concluída com tabela de evidência.</w:t>
       </w:r>
     </w:p>
     <w:p>
@@ -3090,7 +2908,7 @@
         <w:pStyle w:val="ListParagraph"/>
         <w:numPr>
           <w:ilvl w:val="0"/>
-          <w:numId w:val="5"/>
+          <w:numId w:val="4"/>
         </w:numPr>
         <w:spacing w:after="60"/>
       </w:pPr>
@@ -3103,7 +2921,7 @@
         <w:pStyle w:val="ListParagraph"/>
         <w:numPr>
           <w:ilvl w:val="0"/>
-          <w:numId w:val="5"/>
+          <w:numId w:val="4"/>
         </w:numPr>
         <w:spacing w:after="60"/>
       </w:pPr>
@@ -3130,21 +2948,21 @@
 <w:ftr xmlns:wpc="http://schemas.microsoft.com/office/word/2010/wordprocessingCanvas" xmlns:mc="http://schemas.openxmlformats.org/markup-compatibility/2006" xmlns:o="urn:schemas-microsoft-com:office:office" xmlns:r="http://schemas.openxmlformats.org/officeDocument/2006/relationships" xmlns:m="http://schemas.openxmlformats.org/officeDocument/2006/math" xmlns:v="urn:schemas-microsoft-com:vml" xmlns:wp14="http://schemas.microsoft.com/office/word/2010/wordprocessingDrawing" xmlns:wp="http://schemas.openxmlformats.org/drawingml/2006/wordprocessingDrawing" xmlns:w10="urn:schemas-microsoft-com:office:word" xmlns:w="http://schemas.openxmlformats.org/wordprocessingml/2006/main" xmlns:w14="http://schemas.microsoft.com/office/word/2010/wordml" xmlns:w15="http://schemas.microsoft.com/office/word/2012/wordml" xmlns:wpg="http://schemas.microsoft.com/office/word/2010/wordprocessingGroup" xmlns:wpi="http://schemas.microsoft.com/office/word/2010/wordprocessingInk" xmlns:wne="http://schemas.microsoft.com/office/word/2006/wordml" xmlns:wps="http://schemas.microsoft.com/office/word/2010/wordprocessingShape">
   <w:p>
     <w:pPr>
-      <w:jc w:val="right"/>
+      <w:jc w:val="center"/>
     </w:pPr>
     <w:r>
       <w:rPr>
-        <w:color w:val="5B6379"/>
-        <w:sz w:val="16"/>
-        <w:szCs w:val="16"/>
+        <w:color w:val="6B7085"/>
+        <w:sz w:val="18"/>
+        <w:szCs w:val="18"/>
       </w:rPr>
       <w:t xml:space="preserve">Encaixe · próximos passos · página </w:t>
     </w:r>
     <w:r>
       <w:rPr>
-        <w:color w:val="5B6379"/>
-        <w:sz w:val="16"/>
-        <w:szCs w:val="16"/>
+        <w:color w:val="6B7085"/>
+        <w:sz w:val="18"/>
+        <w:szCs w:val="18"/>
       </w:rPr>
       <w:fldChar w:fldCharType="begin"/>
       <w:instrText xml:space="preserve">PAGE</w:instrText>
@@ -3286,7 +3104,7 @@
       <w:lvlText w:val="•"/>
       <w:lvlJc w:val="left"/>
       <w:pPr>
-        <w:ind w:left="540" w:hanging="300"/>
+        <w:ind w:left="720" w:hanging="360"/>
       </w:pPr>
     </w:lvl>
   </w:abstractNum>
@@ -3298,7 +3116,7 @@
       <w:lvlText w:val="%1."/>
       <w:lvlJc w:val="left"/>
       <w:pPr>
-        <w:ind w:left="540" w:hanging="300"/>
+        <w:ind w:left="720" w:hanging="360"/>
       </w:pPr>
     </w:lvl>
   </w:abstractNum>
@@ -3310,19 +3128,7 @@
       <w:lvlText w:val="%1."/>
       <w:lvlJc w:val="left"/>
       <w:pPr>
-        <w:ind w:left="540" w:hanging="300"/>
-      </w:pPr>
-    </w:lvl>
-  </w:abstractNum>
-  <w:abstractNum w:abstractNumId="5" w15:restartNumberingAfterBreak="0">
-    <w:multiLevelType w:val="hybridMultilevel"/>
-    <w:lvl w:ilvl="0" w15:tentative="1">
-      <w:start w:val="1"/>
-      <w:numFmt w:val="decimal"/>
-      <w:lvlText w:val="%1."/>
-      <w:lvlJc w:val="left"/>
-      <w:pPr>
-        <w:ind w:left="540" w:hanging="300"/>
+        <w:ind w:left="720" w:hanging="360"/>
       </w:pPr>
     </w:lvl>
   </w:abstractNum>
@@ -3339,19 +3145,13 @@
     </w:lvlOverride>
   </w:num>
   <w:num w:numId="3">
-    <w:abstractNumId w:val="4"/>
+    <w:abstractNumId w:val="2"/>
     <w:lvlOverride w:ilvl="0">
       <w:startOverride w:val="1"/>
     </w:lvlOverride>
   </w:num>
   <w:num w:numId="4">
-    <w:abstractNumId w:val="2"/>
-    <w:lvlOverride w:ilvl="0">
-      <w:startOverride w:val="1"/>
-    </w:lvlOverride>
-  </w:num>
-  <w:num w:numId="5">
-    <w:abstractNumId w:val="5"/>
+    <w:abstractNumId w:val="4"/>
     <w:lvlOverride w:ilvl="0">
       <w:startOverride w:val="1"/>
     </w:lvlOverride>
@@ -3365,6 +3165,7 @@
     <w:rPrDefault>
       <w:rPr>
         <w:rFonts w:ascii="Arial" w:cs="Arial" w:eastAsia="Arial" w:hAnsi="Arial"/>
+        <w:color w:val="1F2437"/>
         <w:sz w:val="21"/>
         <w:szCs w:val="21"/>
       </w:rPr>
@@ -3511,15 +3312,14 @@
     <w:next w:val="Normal"/>
     <w:qFormat/>
     <w:pPr>
-      <w:spacing w:before="320" w:after="140"/>
       <w:outlineLvl w:val="0"/>
     </w:pPr>
     <w:rPr>
       <w:b/>
       <w:bCs/>
-      <w:color w:val="3B41C5"/>
-      <w:sz w:val="30"/>
-      <w:szCs w:val="30"/>
+      <w:color w:val="2E74B5"/>
+      <w:sz w:val="32"/>
+      <w:szCs w:val="32"/>
     </w:rPr>
   </w:style>
   <w:style w:type="paragraph" w:styleId="Heading2">
@@ -3528,15 +3328,14 @@
     <w:next w:val="Normal"/>
     <w:qFormat/>
     <w:pPr>
-      <w:spacing w:before="220" w:after="100"/>
       <w:outlineLvl w:val="1"/>
     </w:pPr>
     <w:rPr>
       <w:b/>
       <w:bCs/>
-      <w:color w:val="1F2437"/>
-      <w:sz w:val="24"/>
-      <w:szCs w:val="24"/>
+      <w:color w:val="2E74B5"/>
+      <w:sz w:val="26"/>
+      <w:szCs w:val="26"/>
     </w:rPr>
   </w:style>
 </w:styles>

</xml_diff>